<commit_message>
APC 0716140-25: complementa revisão com os autos (IDs, carta de portabilidade, precedentes da parte)
Co-Authored-By: Claude Sonnet 5.5 <noreply@anthropic.com>
Claude-Session: https://claude.ai/code/session_01TWDXF1tqMyfHHjV81dBtaL
</commit_message>
<xml_diff>
--- a/entregas-0716140/9 APC 0716140-25 ACA Marcos NP cobrança ausência de quitação expressa ônus da prova.docx
+++ b/entregas-0716140/9 APC 0716140-25 ACA Marcos NP cobrança ausência de quitação expressa ônus da prova.docx
@@ -1309,13 +1309,13 @@
           <w:szCs w:val="28"/>
         </w:rPr>
       </w:pPr>
-      <w:r>
-        <w:rPr>
-          <w:rFonts w:ascii="Arial" w:hAnsi="Arial" w:cs="Arial"/>
-          <w:sz w:val="28"/>
-          <w:szCs w:val="28"/>
-        </w:rPr>
-        <w:lastRenderedPageBreak/>
+      <w:commentRangeStart w:id="7"/>
+      <w:r>
+        <w:rPr>
+          <w:rFonts w:ascii="Arial" w:hAnsi="Arial" w:cs="Arial"/>
+          <w:sz w:val="28"/>
+          <w:szCs w:val="28"/>
+        </w:rPr>
         <w:t xml:space="preserve">3. </w:t>
       </w:r>
       <w:r>
@@ -1324,7 +1324,107 @@
           <w:sz w:val="28"/>
           <w:szCs w:val="28"/>
         </w:rPr>
-        <w:t>A ré apelou sustentando inexistência do débito, ausência de comprovação do fato constitutivo do direito da autora, falta de apresentação dos boletos bancários e quitação decorrente da portabilidade para outro plano, postulando a improcedência da cobrança.</w:t>
+        <w:t xml:space="preserve">A ré apelou sustentando </w:t>
+      </w:r>
+      <w:r>
+        <w:rPr>
+          <w:rFonts w:ascii="Arial" w:hAnsi="Arial" w:cs="Arial"/>
+          <w:color w:val="808080"/>
+          <w:sz w:val="28"/>
+          <w:szCs w:val="28"/>
+        </w:rPr>
+        <w:t xml:space="preserve">violação da boa-fé objetiva (venire contra factum proprium) e supressio, pela cobrança de débitos não indicados na carta de portabilidade, aplicação</w:t>
+      </w:r>
+      <w:r>
+        <w:rPr>
+          <w:rFonts w:ascii="Arial" w:hAnsi="Arial" w:cs="Arial"/>
+          <w:sz w:val="28"/>
+          <w:szCs w:val="28"/>
+        </w:rPr>
+        <w:t xml:space="preserve"> do </w:t>
+      </w:r>
+      <w:r>
+        <w:rPr>
+          <w:rFonts w:ascii="Arial" w:hAnsi="Arial" w:cs="Arial"/>
+          <w:color w:val="808080"/>
+          <w:sz w:val="28"/>
+          <w:szCs w:val="28"/>
+        </w:rPr>
+        <w:t xml:space="preserve">Código</w:t>
+      </w:r>
+      <w:r>
+        <w:rPr>
+          <w:rFonts w:ascii="Arial" w:hAnsi="Arial" w:cs="Arial"/>
+          <w:sz w:val="28"/>
+          <w:szCs w:val="28"/>
+        </w:rPr>
+        <w:t xml:space="preserve"> de </w:t>
+      </w:r>
+      <w:r>
+        <w:rPr>
+          <w:rFonts w:ascii="Arial" w:hAnsi="Arial" w:cs="Arial"/>
+          <w:color w:val="808080"/>
+          <w:sz w:val="28"/>
+          <w:szCs w:val="28"/>
+        </w:rPr>
+        <w:t xml:space="preserve">Defesa</w:t>
+      </w:r>
+      <w:r>
+        <w:rPr>
+          <w:rFonts w:ascii="Arial" w:hAnsi="Arial" w:cs="Arial"/>
+          <w:sz w:val="28"/>
+          <w:szCs w:val="28"/>
+        </w:rPr>
+        <w:t xml:space="preserve"> do </w:t>
+      </w:r>
+      <w:r>
+        <w:rPr>
+          <w:rFonts w:ascii="Arial" w:hAnsi="Arial" w:cs="Arial"/>
+          <w:color w:val="808080"/>
+          <w:sz w:val="28"/>
+          <w:szCs w:val="28"/>
+        </w:rPr>
+        <w:t xml:space="preserve">Consumidor</w:t>
+      </w:r>
+      <w:r>
+        <w:rPr>
+          <w:rFonts w:ascii="Arial" w:hAnsi="Arial" w:cs="Arial"/>
+          <w:sz w:val="28"/>
+          <w:szCs w:val="28"/>
+        </w:rPr>
+        <w:t xml:space="preserve"> </w:t>
+      </w:r>
+      <w:r>
+        <w:rPr>
+          <w:rFonts w:ascii="Arial" w:hAnsi="Arial" w:cs="Arial"/>
+          <w:color w:val="808080"/>
+          <w:sz w:val="28"/>
+          <w:szCs w:val="28"/>
+        </w:rPr>
+        <w:t xml:space="preserve">e</w:t>
+      </w:r>
+      <w:r>
+        <w:rPr>
+          <w:rFonts w:ascii="Arial" w:hAnsi="Arial" w:cs="Arial"/>
+          <w:sz w:val="28"/>
+          <w:szCs w:val="28"/>
+        </w:rPr>
+        <w:t xml:space="preserve"> falta de apresentação dos boletos bancários</w:t>
+      </w:r>
+      <w:r>
+        <w:rPr>
+          <w:rFonts w:ascii="Arial" w:hAnsi="Arial" w:cs="Arial"/>
+          <w:sz w:val="28"/>
+          <w:szCs w:val="28"/>
+        </w:rPr>
+        <w:t xml:space="preserve">, postulando a improcedência da cobrança.</w:t>
+      </w:r>
+      <w:commentRangeEnd w:id="7"/>
+      <w:r>
+        <w:rPr>
+          <w:rStyle w:val="CommentReference"/>
+        </w:rPr>
+        <w:commentReference w:id="7"/>
       </w:r>
     </w:p>
     <w:p>
@@ -2244,7 +2344,7 @@
           <w:szCs w:val="26"/>
         </w:rPr>
       </w:pPr>
-      <w:commentRangeStart w:id="7"/>
+      <w:commentRangeStart w:id="8"/>
       <w:r>
         <w:rPr>
           <w:rFonts w:ascii="Arial" w:eastAsia="Arial" w:hAnsi="Arial" w:cs="Arial"/>
@@ -2384,12 +2484,12 @@
         </w:rPr>
         <w:t xml:space="preserve"> parágrafo único</w:t>
       </w:r>
-      <w:commentRangeEnd w:id="7"/>
+      <w:commentRangeEnd w:id="8"/>
       <w:r>
         <w:rPr>
           <w:rStyle w:val="CommentReference"/>
         </w:rPr>
-        <w:commentReference w:id="7"/>
+        <w:commentReference w:id="8"/>
       </w:r>
       <w:r>
         <w:rPr>
@@ -2412,7 +2512,7 @@
           <w:szCs w:val="26"/>
         </w:rPr>
       </w:pPr>
-      <w:commentRangeStart w:id="8"/>
+      <w:commentRangeStart w:id="9"/>
       <w:r>
         <w:rPr>
           <w:rFonts w:ascii="Arial" w:eastAsia="Arial" w:hAnsi="Arial" w:cs="Arial"/>
@@ -2532,12 +2632,12 @@
         </w:rPr>
         <w:t xml:space="preserve">.</w:t>
       </w:r>
-      <w:commentRangeEnd w:id="8"/>
+      <w:commentRangeEnd w:id="9"/>
       <w:r>
         <w:rPr>
           <w:rStyle w:val="CommentReference"/>
         </w:rPr>
-        <w:commentReference w:id="8"/>
+        <w:commentReference w:id="9"/>
       </w:r>
     </w:p>
     <w:p>
@@ -2559,7 +2659,7 @@
           <w:color w:val="FF0000"/>
         </w:rPr>
       </w:pPr>
-      <w:commentRangeStart w:id="9"/>
+      <w:commentRangeStart w:id="10"/>
       <w:r>
         <w:rPr>
           <w:rFonts w:cstheme="minorHAnsi"/>
@@ -2569,12 +2669,12 @@
         </w:rPr>
         <w:t>RESUMO DA APELAÇÃO</w:t>
       </w:r>
-      <w:commentRangeEnd w:id="9"/>
+      <w:commentRangeEnd w:id="10"/>
       <w:r>
         <w:rPr>
           <w:rStyle w:val="CommentReference"/>
         </w:rPr>
-        <w:commentReference w:id="9"/>
+        <w:commentReference w:id="10"/>
       </w:r>
     </w:p>
     <w:p>
@@ -3117,7 +3217,7 @@
         </w:rPr>
         <w:t xml:space="preserve">(</w:t>
       </w:r>
-      <w:commentRangeStart w:id="10"/>
+      <w:commentRangeStart w:id="11"/>
       <w:r>
         <w:rPr>
           <w:rFonts w:ascii="Arial" w:hAnsi="Arial" w:cs="Arial"/>
@@ -3128,12 +3228,12 @@
         </w:rPr>
         <w:t xml:space="preserve">.</w:t>
       </w:r>
-      <w:commentRangeEnd w:id="10"/>
+      <w:commentRangeEnd w:id="11"/>
       <w:r>
         <w:rPr>
           <w:rStyle w:val="CommentReference"/>
         </w:rPr>
-        <w:commentReference w:id="10"/>
+        <w:commentReference w:id="11"/>
       </w:r>
       <w:r>
         <w:rPr>
@@ -3450,7 +3550,7 @@
           <w:sz w:val="26"/>
           <w:szCs w:val="26"/>
         </w:rPr>
-        <w:t>A parte ré manifestou desistência em relação ao pedido reconvencional, pedido este que foi homologado no ID 257776291</w:t>
+        <w:t xml:space="preserve">A parte ré manifestou desistência em relação ao pedido reconvencional, pedido este que foi homologado no ID 257776291</w:t>
       </w:r>
       <w:r>
         <w:rPr>
@@ -3460,7 +3560,7 @@
           <w:sz w:val="26"/>
           <w:szCs w:val="26"/>
         </w:rPr>
-        <w:t>.</w:t>
+        <w:t xml:space="preserve">.</w:t>
       </w:r>
       <w:r>
         <w:rPr>
@@ -3475,10 +3575,11 @@
         <w:rPr>
           <w:rFonts w:ascii="Arial" w:hAnsi="Arial" w:cs="Arial"/>
           <w:i/>
+          <w:color w:val="808080"/>
           <w:sz w:val="26"/>
           <w:szCs w:val="26"/>
         </w:rPr>
-        <w:t>85547281</w:t>
+        <w:t xml:space="preserve">88637481</w:t>
       </w:r>
       <w:r>
         <w:rPr>
@@ -3487,7 +3588,7 @@
           <w:sz w:val="26"/>
           <w:szCs w:val="26"/>
         </w:rPr>
-        <w:t>).</w:t>
+        <w:t xml:space="preserve">).</w:t>
       </w:r>
     </w:p>
     <w:p>
@@ -3513,22 +3614,22 @@
           <w:szCs w:val="28"/>
         </w:rPr>
       </w:pPr>
-      <w:commentRangeStart w:id="11"/>
-      <w:r>
-        <w:rPr>
-          <w:rFonts w:ascii="Arial" w:hAnsi="Arial" w:cs="Arial"/>
-          <w:sz w:val="28"/>
-          <w:szCs w:val="28"/>
-        </w:rPr>
-        <w:t>O MM. Juiz sentenciante</w:t>
-      </w:r>
-      <w:r>
-        <w:rPr>
-          <w:rFonts w:ascii="Arial" w:hAnsi="Arial" w:cs="Arial"/>
-          <w:sz w:val="28"/>
-          <w:szCs w:val="28"/>
-        </w:rPr>
-        <w:t>, Dr.</w:t>
+      <w:commentRangeStart w:id="12"/>
+      <w:r>
+        <w:rPr>
+          <w:rFonts w:ascii="Arial" w:hAnsi="Arial" w:cs="Arial"/>
+          <w:sz w:val="28"/>
+          <w:szCs w:val="28"/>
+        </w:rPr>
+        <w:t xml:space="preserve">O MM. Juiz sentenciante</w:t>
+      </w:r>
+      <w:r>
+        <w:rPr>
+          <w:rFonts w:ascii="Arial" w:hAnsi="Arial" w:cs="Arial"/>
+          <w:sz w:val="28"/>
+          <w:szCs w:val="28"/>
+        </w:rPr>
+        <w:t xml:space="preserve">, Dr.</w:t>
       </w:r>
       <w:r>
         <w:rPr>
@@ -3541,26 +3642,11 @@
       <w:r>
         <w:rPr>
           <w:rFonts w:ascii="Arial" w:hAnsi="Arial" w:cs="Arial"/>
-          <w:sz w:val="28"/>
-          <w:szCs w:val="28"/>
-        </w:rPr>
-        <w:t xml:space="preserve">Heversom </w:t>
-      </w:r>
-      <w:r>
-        <w:rPr>
-          <w:rFonts w:ascii="Arial" w:hAnsi="Arial" w:cs="Arial"/>
-          <w:sz w:val="28"/>
-          <w:szCs w:val="28"/>
-        </w:rPr>
-        <w:t>D’Abadia Teixeira Borges</w:t>
-      </w:r>
-      <w:r>
-        <w:rPr>
-          <w:rFonts w:ascii="Arial" w:hAnsi="Arial" w:cs="Arial"/>
-          <w:sz w:val="28"/>
-          <w:szCs w:val="28"/>
-        </w:rPr>
-        <w:t>, da</w:t>
+          <w:color w:val="808080"/>
+          <w:sz w:val="28"/>
+          <w:szCs w:val="28"/>
+        </w:rPr>
+        <w:t xml:space="preserve">Heverson</w:t>
       </w:r>
       <w:r>
         <w:rPr>
@@ -3576,7 +3662,31 @@
           <w:sz w:val="28"/>
           <w:szCs w:val="28"/>
         </w:rPr>
-        <w:t>1</w:t>
+        <w:t xml:space="preserve">D’Abadia Teixeira Borges</w:t>
+      </w:r>
+      <w:r>
+        <w:rPr>
+          <w:rFonts w:ascii="Arial" w:hAnsi="Arial" w:cs="Arial"/>
+          <w:sz w:val="28"/>
+          <w:szCs w:val="28"/>
+        </w:rPr>
+        <w:t xml:space="preserve">, da</w:t>
+      </w:r>
+      <w:r>
+        <w:rPr>
+          <w:rFonts w:ascii="Arial" w:hAnsi="Arial" w:cs="Arial"/>
+          <w:sz w:val="28"/>
+          <w:szCs w:val="28"/>
+        </w:rPr>
+        <w:t xml:space="preserve"> </w:t>
+      </w:r>
+      <w:r>
+        <w:rPr>
+          <w:rFonts w:ascii="Arial" w:hAnsi="Arial" w:cs="Arial"/>
+          <w:sz w:val="28"/>
+          <w:szCs w:val="28"/>
+        </w:rPr>
+        <w:t xml:space="preserve">1</w:t>
       </w:r>
       <w:r>
         <w:rPr>
@@ -3592,22 +3702,22 @@
           <w:sz w:val="28"/>
           <w:szCs w:val="28"/>
         </w:rPr>
-        <w:t>Cível de Brasília</w:t>
-      </w:r>
-      <w:r>
-        <w:rPr>
-          <w:rFonts w:ascii="Arial" w:hAnsi="Arial" w:cs="Arial"/>
-          <w:sz w:val="28"/>
-          <w:szCs w:val="28"/>
-        </w:rPr>
-        <w:t>, julgou no seguinte sentido:</w:t>
-      </w:r>
-      <w:commentRangeEnd w:id="11"/>
+        <w:t xml:space="preserve">Cível de Brasília</w:t>
+      </w:r>
+      <w:r>
+        <w:rPr>
+          <w:rFonts w:ascii="Arial" w:hAnsi="Arial" w:cs="Arial"/>
+          <w:sz w:val="28"/>
+          <w:szCs w:val="28"/>
+        </w:rPr>
+        <w:t xml:space="preserve">, julgou no seguinte sentido:</w:t>
+      </w:r>
+      <w:commentRangeEnd w:id="12"/>
       <w:r>
         <w:rPr>
           <w:rStyle w:val="CommentReference"/>
         </w:rPr>
-        <w:commentReference w:id="11"/>
+        <w:commentReference w:id="12"/>
       </w:r>
     </w:p>
     <w:p>
@@ -3756,15 +3866,26 @@
           <w:sz w:val="26"/>
           <w:szCs w:val="26"/>
         </w:rPr>
-        <w:t>Condeno a requerida ao pagamento das custas processuais e dos honorários advocatícios, que fixo em 10% (dez por cento) sobre o valor atualizado da condenação, nos termos do art. 85, § 2º, do Código de Processo Civil.</w:t>
-      </w:r>
-      <w:r>
-        <w:rPr>
-          <w:rFonts w:ascii="Arial" w:hAnsi="Arial" w:cs="Arial"/>
+        <w:t xml:space="preserve">Condeno a requerida ao pagamento das custas processuais e dos honorários advocatícios, que fixo em 10% (dez por cento) sobre o valor atualizado da condenação, nos termos do art. 85, § 2º, do Código de Processo Civil.</w:t>
+      </w:r>
+      <w:r>
+        <w:rPr>
+          <w:rFonts w:ascii="Arial" w:hAnsi="Arial" w:cs="Arial"/>
+          <w:i/>
           <w:sz w:val="26"/>
           <w:szCs w:val="26"/>
         </w:rPr>
-        <w:t>”</w:t>
+        <w:t xml:space="preserve">”</w:t>
+      </w:r>
+      <w:r>
+        <w:rPr>
+          <w:rFonts w:ascii="Arial" w:hAnsi="Arial" w:cs="Arial"/>
+          <w:i/>
+          <w:color w:val="808080"/>
+          <w:sz w:val="26"/>
+          <w:szCs w:val="26"/>
+        </w:rPr>
+        <w:t xml:space="preserve"> (ID 88637481)</w:t>
       </w:r>
     </w:p>
     <w:p>
@@ -3887,7 +4008,7 @@
           <w:szCs w:val="28"/>
         </w:rPr>
       </w:pPr>
-      <w:commentRangeStart w:id="12"/>
+      <w:commentRangeStart w:id="13"/>
       <w:r>
         <w:rPr>
           <w:rFonts w:ascii="Arial" w:hAnsi="Arial" w:cs="Arial"/>
@@ -3991,12 +4112,23 @@
           <w:sz w:val="28"/>
           <w:szCs w:val="28"/>
         </w:rPr>
-        <w:t xml:space="preserve">: </w:t>
-      </w:r>
-      <w:r>
-        <w:rPr>
-          <w:rFonts w:ascii="Arial" w:hAnsi="Arial" w:cs="Arial"/>
-          <w:b/>
+        <w:t xml:space="preserve">:</w:t>
+      </w:r>
+      <w:r>
+        <w:rPr>
+          <w:rFonts w:ascii="Arial" w:hAnsi="Arial" w:cs="Arial"/>
+          <w:b/>
+          <w:bCs/>
+          <w:sz w:val="28"/>
+          <w:szCs w:val="28"/>
+        </w:rPr>
+        <w:t xml:space="preserve"> </w:t>
+      </w:r>
+      <w:r>
+        <w:rPr>
+          <w:rFonts w:ascii="Arial" w:hAnsi="Arial" w:cs="Arial"/>
+          <w:b/>
+          <w:bCs/>
           <w:color w:val="808080"/>
           <w:sz w:val="28"/>
           <w:szCs w:val="28"/>
@@ -4006,8 +4138,6 @@
       <w:r>
         <w:rPr>
           <w:rFonts w:ascii="Arial" w:hAnsi="Arial" w:cs="Arial"/>
-          <w:b/>
-          <w:bCs/>
           <w:sz w:val="28"/>
           <w:szCs w:val="28"/>
         </w:rPr>
@@ -4016,18 +4146,11 @@
       <w:r>
         <w:rPr>
           <w:rFonts w:ascii="Arial" w:hAnsi="Arial" w:cs="Arial"/>
-          <w:sz w:val="28"/>
-          <w:szCs w:val="28"/>
-        </w:rPr>
-        <w:t xml:space="preserve">nada deve à autora</w:t>
-      </w:r>
-      <w:r>
-        <w:rPr>
-          <w:rFonts w:ascii="Arial" w:hAnsi="Arial" w:cs="Arial"/>
-          <w:sz w:val="28"/>
-          <w:szCs w:val="28"/>
-        </w:rPr>
-        <w:t xml:space="preserve">, que</w:t>
+          <w:color w:val="808080"/>
+          <w:sz w:val="28"/>
+          <w:szCs w:val="28"/>
+        </w:rPr>
+        <w:t xml:space="preserve">a</w:t>
       </w:r>
       <w:r>
         <w:rPr>
@@ -4040,26 +4163,114 @@
       <w:r>
         <w:rPr>
           <w:rFonts w:ascii="Arial" w:hAnsi="Arial" w:cs="Arial"/>
-          <w:sz w:val="28"/>
-          <w:szCs w:val="28"/>
-        </w:rPr>
-        <w:t xml:space="preserve">não se desincumbiu do ônus de demonstrar o fato constitutivo do </w:t>
-      </w:r>
-      <w:r>
-        <w:rPr>
-          <w:rFonts w:ascii="Arial" w:hAnsi="Arial" w:cs="Arial"/>
-          <w:sz w:val="28"/>
-          <w:szCs w:val="28"/>
-        </w:rPr>
-        <w:t xml:space="preserve">seu </w:t>
-      </w:r>
-      <w:r>
-        <w:rPr>
-          <w:rFonts w:ascii="Arial" w:hAnsi="Arial" w:cs="Arial"/>
-          <w:sz w:val="28"/>
-          <w:szCs w:val="28"/>
-        </w:rPr>
-        <w:t xml:space="preserve">direito</w:t>
+          <w:color w:val="808080"/>
+          <w:sz w:val="28"/>
+          <w:szCs w:val="28"/>
+        </w:rPr>
+        <w:t xml:space="preserve">carta de portabilidade atestou a existência de apenas um débito, o que gerou legítima expectativa de quitação e torna contraditória a cobrança posterior (</w:t>
+      </w:r>
+      <w:r>
+        <w:rPr>
+          <w:rFonts w:ascii="Arial" w:hAnsi="Arial" w:cs="Arial"/>
+          <w:i/>
+          <w:color w:val="808080"/>
+          <w:sz w:val="28"/>
+          <w:szCs w:val="28"/>
+        </w:rPr>
+        <w:t xml:space="preserve">venire contra factum proprium</w:t>
+      </w:r>
+      <w:r>
+        <w:rPr>
+          <w:rFonts w:ascii="Arial" w:hAnsi="Arial" w:cs="Arial"/>
+          <w:color w:val="808080"/>
+          <w:sz w:val="28"/>
+          <w:szCs w:val="28"/>
+        </w:rPr>
+        <w:t xml:space="preserve">), em violação da boa-fé objetiva; </w:t>
+      </w:r>
+      <w:r>
+        <w:rPr>
+          <w:rFonts w:ascii="Arial" w:hAnsi="Arial" w:cs="Arial"/>
+          <w:b/>
+          <w:color w:val="808080"/>
+          <w:sz w:val="28"/>
+          <w:szCs w:val="28"/>
+        </w:rPr>
+        <w:t xml:space="preserve">2)</w:t>
+      </w:r>
+      <w:r>
+        <w:rPr>
+          <w:rFonts w:ascii="Arial" w:hAnsi="Arial" w:cs="Arial"/>
+          <w:color w:val="808080"/>
+          <w:sz w:val="28"/>
+          <w:szCs w:val="28"/>
+        </w:rPr>
+        <w:t xml:space="preserve"> operou-se a </w:t>
+      </w:r>
+      <w:r>
+        <w:rPr>
+          <w:rFonts w:ascii="Arial" w:hAnsi="Arial" w:cs="Arial"/>
+          <w:i/>
+          <w:color w:val="808080"/>
+          <w:sz w:val="28"/>
+          <w:szCs w:val="28"/>
+        </w:rPr>
+        <w:t xml:space="preserve">supressio</w:t>
+      </w:r>
+      <w:r>
+        <w:rPr>
+          <w:rFonts w:ascii="Arial" w:hAnsi="Arial" w:cs="Arial"/>
+          <w:color w:val="808080"/>
+          <w:sz w:val="28"/>
+          <w:szCs w:val="28"/>
+        </w:rPr>
+        <w:t xml:space="preserve">, pois a autora deixou de exercer o direito de cobrança na emissão da carta e por anos depois da portabilidade; </w:t>
+      </w:r>
+      <w:r>
+        <w:rPr>
+          <w:rFonts w:ascii="Arial" w:hAnsi="Arial" w:cs="Arial"/>
+          <w:b/>
+          <w:color w:val="808080"/>
+          <w:sz w:val="28"/>
+          <w:szCs w:val="28"/>
+        </w:rPr>
+        <w:t xml:space="preserve">3)</w:t>
+      </w:r>
+      <w:r>
+        <w:rPr>
+          <w:rFonts w:ascii="Arial" w:hAnsi="Arial" w:cs="Arial"/>
+          <w:color w:val="808080"/>
+          <w:sz w:val="28"/>
+          <w:szCs w:val="28"/>
+        </w:rPr>
+        <w:t xml:space="preserve"> aplica-se o Código de Defesa do Consumidor, tendo a autora violado o dever de informação; e </w:t>
+      </w:r>
+      <w:r>
+        <w:rPr>
+          <w:rFonts w:ascii="Arial" w:hAnsi="Arial" w:cs="Arial"/>
+          <w:b/>
+          <w:color w:val="808080"/>
+          <w:sz w:val="28"/>
+          <w:szCs w:val="28"/>
+        </w:rPr>
+        <w:t xml:space="preserve">4)</w:t>
+      </w:r>
+      <w:r>
+        <w:rPr>
+          <w:rFonts w:ascii="Arial" w:hAnsi="Arial" w:cs="Arial"/>
+          <w:color w:val="808080"/>
+          <w:sz w:val="28"/>
+          <w:szCs w:val="28"/>
+        </w:rPr>
+        <w:t xml:space="preserve"> a</w:t>
+      </w:r>
+      <w:r>
+        <w:rPr>
+          <w:rFonts w:ascii="Arial" w:hAnsi="Arial" w:cs="Arial"/>
+          <w:sz w:val="28"/>
+          <w:szCs w:val="28"/>
+        </w:rPr>
+        <w:t xml:space="preserve"> autora</w:t>
       </w:r>
       <w:r>
         <w:rPr>
@@ -4072,10 +4283,44 @@
       <w:r>
         <w:rPr>
           <w:rFonts w:ascii="Arial" w:hAnsi="Arial" w:cs="Arial"/>
-          <w:sz w:val="28"/>
-          <w:szCs w:val="28"/>
-        </w:rPr>
-        <w:t xml:space="preserve">por não ter apresentado os boletos bancários das parcelas </w:t>
+          <w:color w:val="808080"/>
+          <w:sz w:val="28"/>
+          <w:szCs w:val="28"/>
+        </w:rPr>
+        <w:t xml:space="preserve">instada</w:t>
+      </w:r>
+      <w:r>
+        <w:rPr>
+          <w:rFonts w:ascii="Arial" w:hAnsi="Arial" w:cs="Arial"/>
+          <w:sz w:val="28"/>
+          <w:szCs w:val="28"/>
+        </w:rPr>
+        <w:t xml:space="preserve">, </w:t>
+      </w:r>
+      <w:r>
+        <w:rPr>
+          <w:rFonts w:ascii="Arial" w:hAnsi="Arial" w:cs="Arial"/>
+          <w:sz w:val="28"/>
+          <w:szCs w:val="28"/>
+        </w:rPr>
+        <w:t xml:space="preserve">não </w:t>
+      </w:r>
+      <w:r>
+        <w:rPr>
+          <w:rFonts w:ascii="Arial" w:hAnsi="Arial" w:cs="Arial"/>
+          <w:color w:val="808080"/>
+          <w:sz w:val="28"/>
+          <w:szCs w:val="28"/>
+        </w:rPr>
+        <w:t xml:space="preserve">juntou</w:t>
+      </w:r>
+      <w:r>
+        <w:rPr>
+          <w:rFonts w:ascii="Arial" w:hAnsi="Arial" w:cs="Arial"/>
+          <w:sz w:val="28"/>
+          <w:szCs w:val="28"/>
+        </w:rPr>
+        <w:t xml:space="preserve"> os boletos bancários das parcelas </w:t>
       </w:r>
       <w:r>
         <w:rPr>
@@ -4096,121 +4341,17 @@
       <w:r>
         <w:rPr>
           <w:rFonts w:ascii="Arial" w:hAnsi="Arial" w:cs="Arial"/>
-          <w:color w:val="808080"/>
-          <w:sz w:val="28"/>
-          <w:szCs w:val="28"/>
-        </w:rPr>
-        <w:t xml:space="preserve">; </w:t>
-      </w:r>
-      <w:r>
-        <w:rPr>
-          <w:rFonts w:ascii="Arial" w:hAnsi="Arial" w:cs="Arial"/>
-          <w:b/>
-          <w:color w:val="808080"/>
-          <w:sz w:val="28"/>
-          <w:szCs w:val="28"/>
-        </w:rPr>
-        <w:t xml:space="preserve">2)</w:t>
-      </w:r>
-      <w:r>
-        <w:rPr>
-          <w:rFonts w:ascii="Arial" w:hAnsi="Arial" w:cs="Arial"/>
-          <w:color w:val="808080"/>
-          <w:sz w:val="28"/>
-          <w:szCs w:val="28"/>
-        </w:rPr>
-        <w:t xml:space="preserve"> a carta de portabilidade mencionou apenas uma obrigação vincenda em aberto, o que gerou legítima expectativa de quitação e torna contraditória a cobrança posterior (</w:t>
-      </w:r>
-      <w:r>
-        <w:rPr>
-          <w:rFonts w:ascii="Arial" w:hAnsi="Arial" w:cs="Arial"/>
-          <w:i/>
-          <w:color w:val="808080"/>
-          <w:sz w:val="28"/>
-          <w:szCs w:val="28"/>
-        </w:rPr>
-        <w:t xml:space="preserve">venire contra factum proprium</w:t>
-      </w:r>
-      <w:r>
-        <w:rPr>
-          <w:rFonts w:ascii="Arial" w:hAnsi="Arial" w:cs="Arial"/>
-          <w:color w:val="808080"/>
-          <w:sz w:val="28"/>
-          <w:szCs w:val="28"/>
-        </w:rPr>
-        <w:t xml:space="preserve">), em violação da boa-fé objetiva; </w:t>
-      </w:r>
-      <w:r>
-        <w:rPr>
-          <w:rFonts w:ascii="Arial" w:hAnsi="Arial" w:cs="Arial"/>
-          <w:b/>
-          <w:color w:val="808080"/>
-          <w:sz w:val="28"/>
-          <w:szCs w:val="28"/>
-        </w:rPr>
-        <w:t xml:space="preserve">3)</w:t>
-      </w:r>
-      <w:r>
-        <w:rPr>
-          <w:rFonts w:ascii="Arial" w:hAnsi="Arial" w:cs="Arial"/>
-          <w:color w:val="808080"/>
-          <w:sz w:val="28"/>
-          <w:szCs w:val="28"/>
-        </w:rPr>
-        <w:t xml:space="preserve"> operou-se a </w:t>
-      </w:r>
-      <w:r>
-        <w:rPr>
-          <w:rFonts w:ascii="Arial" w:hAnsi="Arial" w:cs="Arial"/>
-          <w:i/>
-          <w:color w:val="808080"/>
-          <w:sz w:val="28"/>
-          <w:szCs w:val="28"/>
-        </w:rPr>
-        <w:t xml:space="preserve">supressio</w:t>
-      </w:r>
-      <w:r>
-        <w:rPr>
-          <w:rFonts w:ascii="Arial" w:hAnsi="Arial" w:cs="Arial"/>
-          <w:color w:val="808080"/>
-          <w:sz w:val="28"/>
-          <w:szCs w:val="28"/>
-        </w:rPr>
-        <w:t xml:space="preserve">, pois a autora deixou de exercer o direito de cobrança por longo período; e </w:t>
-      </w:r>
-      <w:r>
-        <w:rPr>
-          <w:rFonts w:ascii="Arial" w:hAnsi="Arial" w:cs="Arial"/>
-          <w:b/>
-          <w:color w:val="808080"/>
-          <w:sz w:val="28"/>
-          <w:szCs w:val="28"/>
-        </w:rPr>
-        <w:t xml:space="preserve">4)</w:t>
-      </w:r>
-      <w:r>
-        <w:rPr>
-          <w:rFonts w:ascii="Arial" w:hAnsi="Arial" w:cs="Arial"/>
-          <w:color w:val="808080"/>
-          <w:sz w:val="28"/>
-          <w:szCs w:val="28"/>
-        </w:rPr>
-        <w:t xml:space="preserve"> aplica-se o Código de Defesa do Consumidor, e a autora violou o dever de informação</w:t>
-      </w:r>
-      <w:r>
-        <w:rPr>
-          <w:rFonts w:ascii="Arial" w:hAnsi="Arial" w:cs="Arial"/>
           <w:sz w:val="28"/>
           <w:szCs w:val="28"/>
         </w:rPr>
         <w:t xml:space="preserve">.</w:t>
       </w:r>
-      <w:commentRangeEnd w:id="12"/>
+      <w:commentRangeEnd w:id="13"/>
       <w:r>
         <w:rPr>
           <w:rStyle w:val="CommentReference"/>
         </w:rPr>
-        <w:commentReference w:id="12"/>
+        <w:commentReference w:id="13"/>
       </w:r>
     </w:p>
     <w:p>
@@ -4324,7 +4465,7 @@
           <w:szCs w:val="28"/>
         </w:rPr>
       </w:pPr>
-      <w:commentRangeStart w:id="13"/>
+      <w:commentRangeStart w:id="14"/>
       <w:r>
         <w:rPr>
           <w:rFonts w:ascii="Arial" w:hAnsi="Arial" w:cs="Arial"/>
@@ -4340,7 +4481,7 @@
           <w:sz w:val="28"/>
           <w:szCs w:val="28"/>
         </w:rPr>
-        <w:t xml:space="preserve"> (ID 85547286)</w:t>
+        <w:t xml:space="preserve"> (ID 88637494)</w:t>
       </w:r>
       <w:r>
         <w:rPr>
@@ -4718,12 +4859,12 @@
         </w:rPr>
         <w:t xml:space="preserve">.</w:t>
       </w:r>
-      <w:commentRangeEnd w:id="13"/>
+      <w:commentRangeEnd w:id="14"/>
       <w:r>
         <w:rPr>
           <w:rStyle w:val="CommentReference"/>
         </w:rPr>
-        <w:commentReference w:id="13"/>
+        <w:commentReference w:id="14"/>
       </w:r>
     </w:p>
     <w:p>
@@ -4869,7 +5010,7 @@
           <w:szCs w:val="28"/>
         </w:rPr>
       </w:pPr>
-      <w:commentRangeStart w:id="14"/>
+      <w:commentRangeStart w:id="15"/>
       <w:r>
         <w:rPr>
           <w:rFonts w:ascii="Arial" w:hAnsi="Arial" w:cs="Arial"/>
@@ -5138,12 +5279,12 @@
         </w:rPr>
         <w:t xml:space="preserve">.</w:t>
       </w:r>
-      <w:commentRangeEnd w:id="14"/>
+      <w:commentRangeEnd w:id="15"/>
       <w:r>
         <w:rPr>
           <w:rStyle w:val="CommentReference"/>
         </w:rPr>
-        <w:commentReference w:id="14"/>
+        <w:commentReference w:id="15"/>
       </w:r>
     </w:p>
     <w:p>
@@ -5314,7 +5455,7 @@
         </w:rPr>
         <w:t xml:space="preserve">DA MANUTENÇÃO DA CONDENAÇÃO DIANTE </w:t>
       </w:r>
-      <w:commentRangeStart w:id="15"/>
+      <w:commentRangeStart w:id="16"/>
       <w:r>
         <w:rPr>
           <w:rFonts w:ascii="Arial" w:hAnsi="Arial" w:cs="Arial"/>
@@ -5390,12 +5531,12 @@
         </w:rPr>
         <w:t xml:space="preserve"> </w:t>
       </w:r>
-      <w:commentRangeEnd w:id="15"/>
+      <w:commentRangeEnd w:id="16"/>
       <w:r>
         <w:rPr>
           <w:rStyle w:val="CommentReference"/>
         </w:rPr>
-        <w:commentReference w:id="15"/>
+        <w:commentReference w:id="16"/>
       </w:r>
       <w:r>
         <w:rPr>
@@ -5484,7 +5625,16 @@
           <w:sz w:val="28"/>
           <w:szCs w:val="28"/>
         </w:rPr>
-        <w:t xml:space="preserve">: </w:t>
+        <w:t xml:space="preserve">:</w:t>
+      </w:r>
+      <w:r>
+        <w:rPr>
+          <w:rFonts w:ascii="Arial" w:hAnsi="Arial" w:cs="Arial"/>
+          <w:color w:val="000000" w:themeColor="text1"/>
+          <w:sz w:val="28"/>
+          <w:szCs w:val="28"/>
+        </w:rPr>
+        <w:t xml:space="preserve"> </w:t>
       </w:r>
       <w:r>
         <w:rPr>
@@ -5499,7 +5649,6 @@
       <w:r>
         <w:rPr>
           <w:rFonts w:ascii="Arial" w:hAnsi="Arial" w:cs="Arial"/>
-          <w:color w:val="000000" w:themeColor="text1"/>
           <w:sz w:val="28"/>
           <w:szCs w:val="28"/>
         </w:rPr>
@@ -5508,51 +5657,19 @@
       <w:r>
         <w:rPr>
           <w:rFonts w:ascii="Arial" w:hAnsi="Arial" w:cs="Arial"/>
-          <w:sz w:val="28"/>
-          <w:szCs w:val="28"/>
-        </w:rPr>
-        <w:t xml:space="preserve">não possuía débitos em aberto à época da migração para outro plano de saúde, </w:t>
-      </w:r>
-      <w:r>
-        <w:rPr>
-          <w:rFonts w:ascii="Arial" w:hAnsi="Arial" w:cs="Arial"/>
-          <w:sz w:val="28"/>
-          <w:szCs w:val="28"/>
-        </w:rPr>
-        <w:t xml:space="preserve">conforme atestado</w:t>
-      </w:r>
-      <w:r>
-        <w:rPr>
-          <w:rFonts w:ascii="Arial" w:hAnsi="Arial" w:cs="Arial"/>
-          <w:sz w:val="28"/>
-          <w:szCs w:val="28"/>
-        </w:rPr>
-        <w:t xml:space="preserve"> na carta de portabilidade</w:t>
-      </w:r>
-      <w:r>
-        <w:rPr>
-          <w:rFonts w:ascii="Arial" w:hAnsi="Arial" w:cs="Arial"/>
-          <w:sz w:val="28"/>
-          <w:szCs w:val="28"/>
-        </w:rPr>
-        <w:t xml:space="preserve">, </w:t>
-      </w:r>
-      <w:r>
-        <w:rPr>
-          <w:rFonts w:ascii="Arial" w:hAnsi="Arial" w:cs="Arial"/>
-          <w:sz w:val="28"/>
-          <w:szCs w:val="28"/>
-        </w:rPr>
-        <w:t xml:space="preserve">na qual somente é mencionada a existência de uma única obrigação vincenda em aberto</w:t>
-      </w:r>
-      <w:r>
-        <w:rPr>
-          <w:rFonts w:ascii="Arial" w:hAnsi="Arial" w:cs="Arial"/>
-          <w:color w:val="808080"/>
-          <w:sz w:val="28"/>
-          <w:szCs w:val="28"/>
-        </w:rPr>
-        <w:t xml:space="preserve">;</w:t>
+          <w:color w:val="808080"/>
+          <w:sz w:val="28"/>
+          <w:szCs w:val="28"/>
+        </w:rPr>
+        <w:t xml:space="preserve">a</w:t>
+      </w:r>
+      <w:r>
+        <w:rPr>
+          <w:rFonts w:ascii="Arial" w:hAnsi="Arial" w:cs="Arial"/>
+          <w:sz w:val="28"/>
+          <w:szCs w:val="28"/>
+        </w:rPr>
+        <w:t xml:space="preserve"> carta de portabilidade</w:t>
       </w:r>
       <w:r>
         <w:rPr>
@@ -5565,44 +5682,28 @@
       <w:r>
         <w:rPr>
           <w:rFonts w:ascii="Arial" w:hAnsi="Arial" w:cs="Arial"/>
-          <w:b/>
-          <w:color w:val="808080"/>
-          <w:sz w:val="28"/>
-          <w:szCs w:val="28"/>
-        </w:rPr>
-        <w:t xml:space="preserve">2)</w:t>
-      </w:r>
-      <w:r>
-        <w:rPr>
-          <w:rFonts w:ascii="Arial" w:hAnsi="Arial" w:cs="Arial"/>
-          <w:sz w:val="28"/>
-          <w:szCs w:val="28"/>
-        </w:rPr>
-        <w:t xml:space="preserve"> a autora/apelada agiu de forma contrária à boa-fé objetiva, </w:t>
-      </w:r>
-      <w:r>
-        <w:rPr>
-          <w:rFonts w:ascii="Arial" w:hAnsi="Arial" w:cs="Arial"/>
-          <w:sz w:val="28"/>
-          <w:szCs w:val="28"/>
-        </w:rPr>
-        <w:t xml:space="preserve">pois a carta havia gerado expectativa legítima de quitação,</w:t>
-      </w:r>
-      <w:r>
-        <w:rPr>
-          <w:rFonts w:ascii="Arial" w:hAnsi="Arial" w:cs="Arial"/>
-          <w:sz w:val="28"/>
-          <w:szCs w:val="28"/>
-        </w:rPr>
-        <w:t xml:space="preserve"> de modo que a sua conduta posterior c</w:t>
-      </w:r>
-      <w:r>
-        <w:rPr>
-          <w:rFonts w:ascii="Arial" w:hAnsi="Arial" w:cs="Arial"/>
-          <w:sz w:val="28"/>
-          <w:szCs w:val="28"/>
-        </w:rPr>
-        <w:t xml:space="preserve">onfigura</w:t>
+          <w:color w:val="808080"/>
+          <w:sz w:val="28"/>
+          <w:szCs w:val="28"/>
+        </w:rPr>
+        <w:t xml:space="preserve">atestou</w:t>
+      </w:r>
+      <w:r>
+        <w:rPr>
+          <w:rFonts w:ascii="Arial" w:hAnsi="Arial" w:cs="Arial"/>
+          <w:sz w:val="28"/>
+          <w:szCs w:val="28"/>
+        </w:rPr>
+        <w:t xml:space="preserve"> a existência de </w:t>
+      </w:r>
+      <w:r>
+        <w:rPr>
+          <w:rFonts w:ascii="Arial" w:hAnsi="Arial" w:cs="Arial"/>
+          <w:color w:val="808080"/>
+          <w:sz w:val="28"/>
+          <w:szCs w:val="28"/>
+        </w:rPr>
+        <w:t xml:space="preserve">apenas</w:t>
       </w:r>
       <w:r>
         <w:rPr>
@@ -5611,6 +5712,184 @@
           <w:szCs w:val="28"/>
         </w:rPr>
         <w:t xml:space="preserve"> </w:t>
+      </w:r>
+      <w:r>
+        <w:rPr>
+          <w:rFonts w:ascii="Arial" w:hAnsi="Arial" w:cs="Arial"/>
+          <w:color w:val="808080"/>
+          <w:sz w:val="28"/>
+          <w:szCs w:val="28"/>
+        </w:rPr>
+        <w:t xml:space="preserve">um</w:t>
+      </w:r>
+      <w:r>
+        <w:rPr>
+          <w:rFonts w:ascii="Arial" w:hAnsi="Arial" w:cs="Arial"/>
+          <w:sz w:val="28"/>
+          <w:szCs w:val="28"/>
+        </w:rPr>
+        <w:t xml:space="preserve"> </w:t>
+      </w:r>
+      <w:r>
+        <w:rPr>
+          <w:rFonts w:ascii="Arial" w:hAnsi="Arial" w:cs="Arial"/>
+          <w:color w:val="808080"/>
+          <w:sz w:val="28"/>
+          <w:szCs w:val="28"/>
+        </w:rPr>
+        <w:t xml:space="preserve">débito,</w:t>
+      </w:r>
+      <w:r>
+        <w:rPr>
+          <w:rFonts w:ascii="Arial" w:hAnsi="Arial" w:cs="Arial"/>
+          <w:sz w:val="28"/>
+          <w:szCs w:val="28"/>
+        </w:rPr>
+        <w:t xml:space="preserve"> </w:t>
+      </w:r>
+      <w:r>
+        <w:rPr>
+          <w:rFonts w:ascii="Arial" w:hAnsi="Arial" w:cs="Arial"/>
+          <w:color w:val="808080"/>
+          <w:sz w:val="28"/>
+          <w:szCs w:val="28"/>
+        </w:rPr>
+        <w:t xml:space="preserve">o</w:t>
+      </w:r>
+      <w:r>
+        <w:rPr>
+          <w:rFonts w:ascii="Arial" w:hAnsi="Arial" w:cs="Arial"/>
+          <w:sz w:val="28"/>
+          <w:szCs w:val="28"/>
+        </w:rPr>
+        <w:t xml:space="preserve"> que </w:t>
+      </w:r>
+      <w:r>
+        <w:rPr>
+          <w:rFonts w:ascii="Arial" w:hAnsi="Arial" w:cs="Arial"/>
+          <w:color w:val="808080"/>
+          <w:sz w:val="28"/>
+          <w:szCs w:val="28"/>
+        </w:rPr>
+        <w:t xml:space="preserve">gerou</w:t>
+      </w:r>
+      <w:r>
+        <w:rPr>
+          <w:rFonts w:ascii="Arial" w:hAnsi="Arial" w:cs="Arial"/>
+          <w:sz w:val="28"/>
+          <w:szCs w:val="28"/>
+        </w:rPr>
+        <w:t xml:space="preserve"> </w:t>
+      </w:r>
+      <w:r>
+        <w:rPr>
+          <w:rFonts w:ascii="Arial" w:hAnsi="Arial" w:cs="Arial"/>
+          <w:color w:val="808080"/>
+          <w:sz w:val="28"/>
+          <w:szCs w:val="28"/>
+        </w:rPr>
+        <w:t xml:space="preserve">legítima</w:t>
+      </w:r>
+      <w:r>
+        <w:rPr>
+          <w:rFonts w:ascii="Arial" w:hAnsi="Arial" w:cs="Arial"/>
+          <w:sz w:val="28"/>
+          <w:szCs w:val="28"/>
+        </w:rPr>
+        <w:t xml:space="preserve"> expectativa</w:t>
+      </w:r>
+      <w:r>
+        <w:rPr>
+          <w:rFonts w:ascii="Arial" w:hAnsi="Arial" w:cs="Arial"/>
+          <w:sz w:val="28"/>
+          <w:szCs w:val="28"/>
+        </w:rPr>
+        <w:t xml:space="preserve"> de quitação</w:t>
+      </w:r>
+      <w:r>
+        <w:rPr>
+          <w:rFonts w:ascii="Arial" w:hAnsi="Arial" w:cs="Arial"/>
+          <w:sz w:val="28"/>
+          <w:szCs w:val="28"/>
+        </w:rPr>
+        <w:t xml:space="preserve"> </w:t>
+      </w:r>
+      <w:r>
+        <w:rPr>
+          <w:rFonts w:ascii="Arial" w:hAnsi="Arial" w:cs="Arial"/>
+          <w:color w:val="808080"/>
+          <w:sz w:val="28"/>
+          <w:szCs w:val="28"/>
+        </w:rPr>
+        <w:t xml:space="preserve">e</w:t>
+      </w:r>
+      <w:r>
+        <w:rPr>
+          <w:rFonts w:ascii="Arial" w:hAnsi="Arial" w:cs="Arial"/>
+          <w:sz w:val="28"/>
+          <w:szCs w:val="28"/>
+        </w:rPr>
+        <w:t xml:space="preserve"> </w:t>
+      </w:r>
+      <w:r>
+        <w:rPr>
+          <w:rFonts w:ascii="Arial" w:hAnsi="Arial" w:cs="Arial"/>
+          <w:color w:val="808080"/>
+          <w:sz w:val="28"/>
+          <w:szCs w:val="28"/>
+        </w:rPr>
+        <w:t xml:space="preserve">torna</w:t>
+      </w:r>
+      <w:r>
+        <w:rPr>
+          <w:rFonts w:ascii="Arial" w:hAnsi="Arial" w:cs="Arial"/>
+          <w:sz w:val="28"/>
+          <w:szCs w:val="28"/>
+        </w:rPr>
+        <w:t xml:space="preserve"> </w:t>
+      </w:r>
+      <w:r>
+        <w:rPr>
+          <w:rFonts w:ascii="Arial" w:hAnsi="Arial" w:cs="Arial"/>
+          <w:color w:val="808080"/>
+          <w:sz w:val="28"/>
+          <w:szCs w:val="28"/>
+        </w:rPr>
+        <w:t xml:space="preserve">contraditória</w:t>
+      </w:r>
+      <w:r>
+        <w:rPr>
+          <w:rFonts w:ascii="Arial" w:hAnsi="Arial" w:cs="Arial"/>
+          <w:sz w:val="28"/>
+          <w:szCs w:val="28"/>
+        </w:rPr>
+        <w:t xml:space="preserve"> a </w:t>
+      </w:r>
+      <w:r>
+        <w:rPr>
+          <w:rFonts w:ascii="Arial" w:hAnsi="Arial" w:cs="Arial"/>
+          <w:color w:val="808080"/>
+          <w:sz w:val="28"/>
+          <w:szCs w:val="28"/>
+        </w:rPr>
+        <w:t xml:space="preserve">cobrança</w:t>
+      </w:r>
+      <w:r>
+        <w:rPr>
+          <w:rFonts w:ascii="Arial" w:hAnsi="Arial" w:cs="Arial"/>
+          <w:sz w:val="28"/>
+          <w:szCs w:val="28"/>
+        </w:rPr>
+        <w:t xml:space="preserve"> posterior </w:t>
+      </w:r>
+      <w:r>
+        <w:rPr>
+          <w:rFonts w:ascii="Arial" w:hAnsi="Arial" w:cs="Arial"/>
+          <w:color w:val="808080"/>
+          <w:sz w:val="28"/>
+          <w:szCs w:val="28"/>
+        </w:rPr>
+        <w:t xml:space="preserve">(</w:t>
       </w:r>
       <w:r>
         <w:rPr>
@@ -5631,7 +5910,7 @@
           <w:sz w:val="28"/>
           <w:szCs w:val="28"/>
         </w:rPr>
-        <w:t xml:space="preserve">;</w:t>
+        <w:t xml:space="preserve">),</w:t>
       </w:r>
       <w:r>
         <w:rPr>
@@ -5644,6 +5923,128 @@
       <w:r>
         <w:rPr>
           <w:rFonts w:ascii="Arial" w:hAnsi="Arial" w:cs="Arial"/>
+          <w:color w:val="808080"/>
+          <w:sz w:val="28"/>
+          <w:szCs w:val="28"/>
+        </w:rPr>
+        <w:t xml:space="preserve">em</w:t>
+      </w:r>
+      <w:r>
+        <w:rPr>
+          <w:rFonts w:ascii="Arial" w:hAnsi="Arial" w:cs="Arial"/>
+          <w:sz w:val="28"/>
+          <w:szCs w:val="28"/>
+        </w:rPr>
+        <w:t xml:space="preserve"> </w:t>
+      </w:r>
+      <w:r>
+        <w:rPr>
+          <w:rFonts w:ascii="Arial" w:hAnsi="Arial" w:cs="Arial"/>
+          <w:color w:val="808080"/>
+          <w:sz w:val="28"/>
+          <w:szCs w:val="28"/>
+        </w:rPr>
+        <w:t xml:space="preserve">violação da boa-fé objetiva; </w:t>
+      </w:r>
+      <w:r>
+        <w:rPr>
+          <w:rFonts w:ascii="Arial" w:hAnsi="Arial" w:cs="Arial"/>
+          <w:b/>
+          <w:color w:val="808080"/>
+          <w:sz w:val="28"/>
+          <w:szCs w:val="28"/>
+        </w:rPr>
+        <w:t xml:space="preserve">2)</w:t>
+      </w:r>
+      <w:r>
+        <w:rPr>
+          <w:rFonts w:ascii="Arial" w:hAnsi="Arial" w:cs="Arial"/>
+          <w:sz w:val="28"/>
+          <w:szCs w:val="28"/>
+        </w:rPr>
+        <w:t xml:space="preserve"> a ausência de exercício oportuno </w:t>
+      </w:r>
+      <w:r>
+        <w:rPr>
+          <w:rFonts w:ascii="Arial" w:hAnsi="Arial" w:cs="Arial"/>
+          <w:color w:val="808080"/>
+          <w:sz w:val="28"/>
+          <w:szCs w:val="28"/>
+        </w:rPr>
+        <w:t xml:space="preserve">do direito de cobrança, na emissão </w:t>
+      </w:r>
+      <w:r>
+        <w:rPr>
+          <w:rFonts w:ascii="Arial" w:hAnsi="Arial" w:cs="Arial"/>
+          <w:sz w:val="28"/>
+          <w:szCs w:val="28"/>
+        </w:rPr>
+        <w:t xml:space="preserve">da </w:t>
+      </w:r>
+      <w:r>
+        <w:rPr>
+          <w:rFonts w:ascii="Arial" w:hAnsi="Arial" w:cs="Arial"/>
+          <w:color w:val="808080"/>
+          <w:sz w:val="28"/>
+          <w:szCs w:val="28"/>
+        </w:rPr>
+        <w:t xml:space="preserve">carta e por anos depois,</w:t>
+      </w:r>
+      <w:r>
+        <w:rPr>
+          <w:rFonts w:ascii="Arial" w:hAnsi="Arial" w:cs="Arial"/>
+          <w:sz w:val="28"/>
+          <w:szCs w:val="28"/>
+        </w:rPr>
+        <w:t xml:space="preserve"> acarreta a supressão do direito</w:t>
+      </w:r>
+      <w:r>
+        <w:rPr>
+          <w:rFonts w:ascii="Arial" w:hAnsi="Arial" w:cs="Arial"/>
+          <w:sz w:val="28"/>
+          <w:szCs w:val="28"/>
+        </w:rPr>
+        <w:t xml:space="preserve"> </w:t>
+      </w:r>
+      <w:r>
+        <w:rPr>
+          <w:rFonts w:ascii="Arial" w:hAnsi="Arial" w:cs="Arial"/>
+          <w:color w:val="808080"/>
+          <w:sz w:val="28"/>
+          <w:szCs w:val="28"/>
+        </w:rPr>
+        <w:t xml:space="preserve">(</w:t>
+      </w:r>
+      <w:r>
+        <w:rPr>
+          <w:rFonts w:ascii="Arial" w:hAnsi="Arial" w:cs="Arial"/>
+          <w:i/>
+          <w:color w:val="808080"/>
+          <w:sz w:val="28"/>
+          <w:szCs w:val="28"/>
+        </w:rPr>
+        <w:t xml:space="preserve">supressio</w:t>
+      </w:r>
+      <w:r>
+        <w:rPr>
+          <w:rFonts w:ascii="Arial" w:hAnsi="Arial" w:cs="Arial"/>
+          <w:color w:val="808080"/>
+          <w:sz w:val="28"/>
+          <w:szCs w:val="28"/>
+        </w:rPr>
+        <w:t xml:space="preserve">);</w:t>
+      </w:r>
+      <w:r>
+        <w:rPr>
+          <w:rFonts w:ascii="Arial" w:hAnsi="Arial" w:cs="Arial"/>
+          <w:sz w:val="28"/>
+          <w:szCs w:val="28"/>
+        </w:rPr>
+        <w:t xml:space="preserve"> </w:t>
+      </w:r>
+      <w:r>
+        <w:rPr>
+          <w:rFonts w:ascii="Arial" w:hAnsi="Arial" w:cs="Arial"/>
           <w:b/>
           <w:color w:val="808080"/>
           <w:sz w:val="28"/>
@@ -5657,22 +6058,6 @@
           <w:sz w:val="28"/>
           <w:szCs w:val="28"/>
         </w:rPr>
-        <w:t xml:space="preserve"> a ausência de exercício oportuno da pretensão</w:t>
-      </w:r>
-      <w:r>
-        <w:rPr>
-          <w:rFonts w:ascii="Arial" w:hAnsi="Arial" w:cs="Arial"/>
-          <w:sz w:val="28"/>
-          <w:szCs w:val="28"/>
-        </w:rPr>
-        <w:t xml:space="preserve"> acarreta a supressão do direito</w:t>
-      </w:r>
-      <w:r>
-        <w:rPr>
-          <w:rFonts w:ascii="Arial" w:hAnsi="Arial" w:cs="Arial"/>
-          <w:sz w:val="28"/>
-          <w:szCs w:val="28"/>
-        </w:rPr>
         <w:t xml:space="preserve"> </w:t>
       </w:r>
       <w:r>
@@ -5682,26 +6067,7 @@
           <w:sz w:val="28"/>
           <w:szCs w:val="28"/>
         </w:rPr>
-        <w:t xml:space="preserve">(</w:t>
-      </w:r>
-      <w:r>
-        <w:rPr>
-          <w:rFonts w:ascii="Arial" w:hAnsi="Arial" w:cs="Arial"/>
-          <w:i/>
-          <w:color w:val="808080"/>
-          <w:sz w:val="28"/>
-          <w:szCs w:val="28"/>
-        </w:rPr>
-        <w:t xml:space="preserve">supressio</w:t>
-      </w:r>
-      <w:r>
-        <w:rPr>
-          <w:rFonts w:ascii="Arial" w:hAnsi="Arial" w:cs="Arial"/>
-          <w:color w:val="808080"/>
-          <w:sz w:val="28"/>
-          <w:szCs w:val="28"/>
-        </w:rPr>
-        <w:t xml:space="preserve">);</w:t>
+        <w:t xml:space="preserve">aplica-se</w:t>
       </w:r>
       <w:r>
         <w:rPr>
@@ -5718,7 +6084,92 @@
           <w:sz w:val="28"/>
           <w:szCs w:val="28"/>
         </w:rPr>
-        <w:t xml:space="preserve">e </w:t>
+        <w:t xml:space="preserve">o</w:t>
+      </w:r>
+      <w:r>
+        <w:rPr>
+          <w:rFonts w:ascii="Arial" w:hAnsi="Arial" w:cs="Arial"/>
+          <w:sz w:val="28"/>
+          <w:szCs w:val="28"/>
+        </w:rPr>
+        <w:t xml:space="preserve"> Código de Defesa do Consumidor, </w:t>
+      </w:r>
+      <w:r>
+        <w:rPr>
+          <w:rFonts w:ascii="Arial" w:hAnsi="Arial" w:cs="Arial"/>
+          <w:color w:val="808080"/>
+          <w:sz w:val="28"/>
+          <w:szCs w:val="28"/>
+        </w:rPr>
+        <w:t xml:space="preserve">tendo</w:t>
+      </w:r>
+      <w:r>
+        <w:rPr>
+          <w:rFonts w:ascii="Arial" w:hAnsi="Arial" w:cs="Arial"/>
+          <w:sz w:val="28"/>
+          <w:szCs w:val="28"/>
+        </w:rPr>
+        <w:t xml:space="preserve"> a </w:t>
+      </w:r>
+      <w:r>
+        <w:rPr>
+          <w:rFonts w:ascii="Arial" w:hAnsi="Arial" w:cs="Arial"/>
+          <w:color w:val="808080"/>
+          <w:sz w:val="28"/>
+          <w:szCs w:val="28"/>
+        </w:rPr>
+        <w:t xml:space="preserve">autora</w:t>
+      </w:r>
+      <w:r>
+        <w:rPr>
+          <w:rFonts w:ascii="Arial" w:hAnsi="Arial" w:cs="Arial"/>
+          <w:sz w:val="28"/>
+          <w:szCs w:val="28"/>
+        </w:rPr>
+        <w:t xml:space="preserve"> </w:t>
+      </w:r>
+      <w:r>
+        <w:rPr>
+          <w:rFonts w:ascii="Arial" w:hAnsi="Arial" w:cs="Arial"/>
+          <w:color w:val="808080"/>
+          <w:sz w:val="28"/>
+          <w:szCs w:val="28"/>
+        </w:rPr>
+        <w:t xml:space="preserve">violado</w:t>
+      </w:r>
+      <w:r>
+        <w:rPr>
+          <w:rFonts w:ascii="Arial" w:hAnsi="Arial" w:cs="Arial"/>
+          <w:sz w:val="28"/>
+          <w:szCs w:val="28"/>
+        </w:rPr>
+        <w:t xml:space="preserve"> </w:t>
+      </w:r>
+      <w:r>
+        <w:rPr>
+          <w:rFonts w:ascii="Arial" w:hAnsi="Arial" w:cs="Arial"/>
+          <w:color w:val="808080"/>
+          <w:sz w:val="28"/>
+          <w:szCs w:val="28"/>
+        </w:rPr>
+        <w:t xml:space="preserve">o</w:t>
+      </w:r>
+      <w:r>
+        <w:rPr>
+          <w:rFonts w:ascii="Arial" w:hAnsi="Arial" w:cs="Arial"/>
+          <w:sz w:val="28"/>
+          <w:szCs w:val="28"/>
+        </w:rPr>
+        <w:t xml:space="preserve"> </w:t>
+      </w:r>
+      <w:r>
+        <w:rPr>
+          <w:rFonts w:ascii="Arial" w:hAnsi="Arial" w:cs="Arial"/>
+          <w:color w:val="808080"/>
+          <w:sz w:val="28"/>
+          <w:szCs w:val="28"/>
+        </w:rPr>
+        <w:t xml:space="preserve">dever de informação; e </w:t>
       </w:r>
       <w:r>
         <w:rPr>
@@ -5733,27 +6184,11 @@
       <w:r>
         <w:rPr>
           <w:rFonts w:ascii="Arial" w:hAnsi="Arial" w:cs="Arial"/>
-          <w:sz w:val="28"/>
-          <w:szCs w:val="28"/>
-        </w:rPr>
-        <w:t xml:space="preserve"> houve violação ao dever de informação</w:t>
-      </w:r>
-      <w:r>
-        <w:rPr>
-          <w:rFonts w:ascii="Arial" w:hAnsi="Arial" w:cs="Arial"/>
-          <w:sz w:val="28"/>
-          <w:szCs w:val="28"/>
-        </w:rPr>
-        <w:t xml:space="preserve">, previsto no Código de Defesa do Consumidor, que protege a parte vulnerável da relação</w:t>
-      </w:r>
-      <w:r>
-        <w:rPr>
-          <w:rFonts w:ascii="Arial" w:hAnsi="Arial" w:cs="Arial"/>
-          <w:color w:val="808080"/>
-          <w:sz w:val="28"/>
-          <w:szCs w:val="28"/>
-        </w:rPr>
-        <w:t xml:space="preserve"> (ID 88637491)</w:t>
+          <w:color w:val="808080"/>
+          <w:sz w:val="28"/>
+          <w:szCs w:val="28"/>
+        </w:rPr>
+        <w:t xml:space="preserve"> a autora, instada, não juntou os boletos bancários das parcelas cobradas (ID 88637491)</w:t>
       </w:r>
       <w:r>
         <w:rPr>
@@ -5968,7 +6403,7 @@
           <w:szCs w:val="28"/>
         </w:rPr>
       </w:pPr>
-      <w:commentRangeStart w:id="16"/>
+      <w:commentRangeStart w:id="17"/>
       <w:r>
         <w:rPr>
           <w:rFonts w:ascii="Arial" w:hAnsi="Arial" w:cs="Arial"/>
@@ -5992,14 +6427,31 @@
           <w:sz w:val="28"/>
           <w:szCs w:val="28"/>
         </w:rPr>
-        <w:t xml:space="preserve"> contrato em análise, cujo plano de saúde é administrado por uma entidade de autogestão.</w:t>
-      </w:r>
-      <w:commentRangeEnd w:id="16"/>
+        <w:t xml:space="preserve"> contrato em análise, cujo plano de saúde é administrado por uma entidade de autogestão</w:t>
+      </w:r>
+      <w:r>
+        <w:rPr>
+          <w:rFonts w:ascii="Arial" w:hAnsi="Arial" w:cs="Arial"/>
+          <w:color w:val="808080"/>
+          <w:sz w:val="28"/>
+          <w:szCs w:val="28"/>
+        </w:rPr>
+        <w:t xml:space="preserve"> (ID 88637033)</w:t>
+      </w:r>
+      <w:r>
+        <w:rPr>
+          <w:rFonts w:ascii="Arial" w:hAnsi="Arial" w:cs="Arial"/>
+          <w:sz w:val="28"/>
+          <w:szCs w:val="28"/>
+        </w:rPr>
+        <w:t xml:space="preserve">.</w:t>
+      </w:r>
+      <w:commentRangeEnd w:id="17"/>
       <w:r>
         <w:rPr>
           <w:rStyle w:val="CommentReference"/>
         </w:rPr>
-        <w:commentReference w:id="16"/>
+        <w:commentReference w:id="17"/>
       </w:r>
     </w:p>
     <w:p>
@@ -6025,7 +6477,7 @@
           <w:szCs w:val="28"/>
         </w:rPr>
       </w:pPr>
-      <w:commentRangeStart w:id="17"/>
+      <w:commentRangeStart w:id="18"/>
       <w:r>
         <w:rPr>
           <w:rFonts w:ascii="Arial" w:hAnsi="Arial" w:cs="Arial"/>
@@ -6085,12 +6537,12 @@
         </w:rPr>
         <w:t xml:space="preserve"> I e II</w:t>
       </w:r>
-      <w:commentRangeEnd w:id="17"/>
+      <w:commentRangeEnd w:id="18"/>
       <w:r>
         <w:rPr>
           <w:rStyle w:val="CommentReference"/>
         </w:rPr>
-        <w:commentReference w:id="17"/>
+        <w:commentReference w:id="18"/>
       </w:r>
       <w:r>
         <w:rPr>
@@ -6551,7 +7003,7 @@
           <w:szCs w:val="28"/>
         </w:rPr>
       </w:pPr>
-      <w:commentRangeStart w:id="18"/>
+      <w:commentRangeStart w:id="19"/>
       <w:r>
         <w:rPr>
           <w:rFonts w:ascii="Arial" w:hAnsi="Arial" w:cs="Arial"/>
@@ -6599,14 +7051,43 @@
           <w:szCs w:val="28"/>
           <w:highlight w:val="yellow"/>
         </w:rPr>
-        <w:t xml:space="preserve">”.</w:t>
-      </w:r>
-      <w:commentRangeEnd w:id="18"/>
+        <w:t xml:space="preserve">”</w:t>
+      </w:r>
+      <w:r>
+        <w:rPr>
+          <w:rFonts w:ascii="Arial" w:hAnsi="Arial" w:cs="Arial"/>
+          <w:color w:val="808080"/>
+          <w:sz w:val="28"/>
+          <w:szCs w:val="28"/>
+          <w:highlight w:val="yellow"/>
+        </w:rPr>
+        <w:t xml:space="preserve">,</w:t>
+      </w:r>
+      <w:r>
+        <w:rPr>
+          <w:rFonts w:ascii="Arial" w:hAnsi="Arial" w:cs="Arial"/>
+          <w:sz w:val="28"/>
+          <w:szCs w:val="28"/>
+          <w:highlight w:val="yellow"/>
+        </w:rPr>
+        <w:t xml:space="preserve"> </w:t>
+      </w:r>
+      <w:commentRangeEnd w:id="19"/>
       <w:r>
         <w:rPr>
           <w:rStyle w:val="CommentReference"/>
         </w:rPr>
-        <w:commentReference w:id="18"/>
+        <w:commentReference w:id="19"/>
+      </w:r>
+      <w:r>
+        <w:rPr>
+          <w:rFonts w:ascii="Arial" w:hAnsi="Arial" w:cs="Arial"/>
+          <w:color w:val="808080"/>
+          <w:sz w:val="28"/>
+          <w:szCs w:val="28"/>
+          <w:highlight w:val="yellow"/>
+        </w:rPr>
+        <w:t xml:space="preserve">com a advertência de que as mensalidades devem ser pagas até o cancelamento (ID 88637463):</w:t>
       </w:r>
     </w:p>
     <w:p>
@@ -6624,40 +7105,7 @@
     <w:p>
       <w:pPr>
         <w:spacing w:after="0" w:line="360" w:lineRule="auto"/>
-        <w:ind w:firstLine="2268"/>
-        <w:jc w:val="both"/>
-        <w:rPr>
-          <w:rFonts w:ascii="Arial" w:hAnsi="Arial" w:cs="Arial"/>
-          <w:sz w:val="28"/>
-          <w:szCs w:val="28"/>
-        </w:rPr>
-      </w:pPr>
-      <w:r>
-        <w:rPr>
-          <w:rFonts w:ascii="Arial" w:hAnsi="Arial" w:cs="Arial"/>
-          <w:color w:val="808080"/>
-          <w:sz w:val="28"/>
-          <w:szCs w:val="28"/>
-        </w:rPr>
-        <w:t xml:space="preserve">Quanto à quitação tácita, dispõe o art. 320 do CC:</w:t>
-      </w:r>
-    </w:p>
-    <w:p>
-      <w:pPr>
-        <w:spacing w:after="0" w:line="360" w:lineRule="auto"/>
-        <w:ind w:firstLine="2268"/>
-        <w:jc w:val="both"/>
-        <w:rPr>
-          <w:rFonts w:ascii="Arial" w:hAnsi="Arial" w:cs="Arial"/>
-          <w:sz w:val="28"/>
-          <w:szCs w:val="28"/>
-        </w:rPr>
-      </w:pPr>
-    </w:p>
-    <w:p>
-      <w:pPr>
-        <w:spacing w:after="0" w:line="360" w:lineRule="auto"/>
-        <w:ind w:left="2268" w:firstLine="0"/>
+        <w:ind w:left="2268" w:firstLine="1134"/>
         <w:jc w:val="both"/>
         <w:rPr>
           <w:rFonts w:ascii="Arial" w:hAnsi="Arial" w:cs="Arial"/>
@@ -6671,35 +7119,26 @@
           <w:i/>
           <w:color w:val="808080"/>
           <w:sz w:val="26"/>
-        </w:rPr>
-        <w:t xml:space="preserve">“Art. 320. A quitação, que sempre poderá ser dada por instrumento particular, designará o valor e a espécie da dívida quitada, o nome do devedor, ou quem por este pagou, o tempo e o lugar do pagamento, com a assinatura do credor, ou do seu representante.</w:t>
-      </w:r>
-    </w:p>
-    <w:p>
-      <w:pPr>
-        <w:spacing w:after="0" w:line="360" w:lineRule="auto"/>
-        <w:ind w:left="2268" w:firstLine="0"/>
-        <w:jc w:val="both"/>
-        <w:rPr>
-          <w:rFonts w:ascii="Arial" w:hAnsi="Arial" w:cs="Arial"/>
-          <w:sz w:val="28"/>
-          <w:szCs w:val="28"/>
-        </w:rPr>
-      </w:pPr>
+          <w:szCs w:val="28"/>
+        </w:rPr>
+        <w:t xml:space="preserve">“Situação financeira atual do contrato: </w:t>
+      </w:r>
       <w:r>
         <w:rPr>
           <w:rFonts w:ascii="Arial" w:hAnsi="Arial" w:cs="Arial"/>
           <w:i/>
           <w:color w:val="808080"/>
           <w:sz w:val="26"/>
-        </w:rPr>
-        <w:t xml:space="preserve">(...)</w:t>
-      </w:r>
-    </w:p>
-    <w:p>
-      <w:pPr>
-        <w:spacing w:after="0" w:line="360" w:lineRule="auto"/>
-        <w:ind w:left="2268" w:firstLine="0"/>
+          <w:szCs w:val="28"/>
+          <w:u w:val="single"/>
+        </w:rPr>
+        <w:t xml:space="preserve">INADIMPLENTE</w:t>
+      </w:r>
+    </w:p>
+    <w:p>
+      <w:pPr>
+        <w:spacing w:after="0" w:line="360" w:lineRule="auto"/>
+        <w:ind w:left="2268" w:firstLine="1134"/>
         <w:jc w:val="both"/>
         <w:rPr>
           <w:rFonts w:ascii="Arial" w:hAnsi="Arial" w:cs="Arial"/>
@@ -6714,8 +7153,20 @@
           <w:color w:val="808080"/>
           <w:sz w:val="26"/>
         </w:rPr>
-        <w:t xml:space="preserve">Parágrafo único. Ainda sem os requisitos estabelecidos neste artigo valerá a quitação, </w:t>
-      </w:r>
+        <w:t xml:space="preserve">Dados da última mensalidade: Data de Vencimento 10/09/2021 – Valor da Mensalidade (R$) 1386.22</w:t>
+      </w:r>
+    </w:p>
+    <w:p>
+      <w:pPr>
+        <w:spacing w:after="0" w:line="360" w:lineRule="auto"/>
+        <w:ind w:left="2268" w:firstLine="1134"/>
+        <w:jc w:val="both"/>
+        <w:rPr>
+          <w:rFonts w:ascii="Arial" w:hAnsi="Arial" w:cs="Arial"/>
+          <w:sz w:val="28"/>
+          <w:szCs w:val="28"/>
+        </w:rPr>
+      </w:pPr>
       <w:r>
         <w:rPr>
           <w:rFonts w:ascii="Arial" w:hAnsi="Arial" w:cs="Arial"/>
@@ -6724,6 +7175,132 @@
           <w:sz w:val="26"/>
           <w:u w:val="single"/>
         </w:rPr>
+        <w:t xml:space="preserve">Até que haja a efetivação do cancelamento as mensalidades devem ser quitadas regularmente.</w:t>
+      </w:r>
+      <w:r>
+        <w:rPr>
+          <w:rFonts w:ascii="Arial" w:hAnsi="Arial" w:cs="Arial"/>
+          <w:i/>
+          <w:color w:val="808080"/>
+          <w:sz w:val="26"/>
+        </w:rPr>
+        <w:t xml:space="preserve">” – Grifei</w:t>
+      </w:r>
+    </w:p>
+    <w:p>
+      <w:pPr>
+        <w:spacing w:after="0" w:line="360" w:lineRule="auto"/>
+        <w:ind w:left="2268" w:firstLine="1134"/>
+        <w:jc w:val="both"/>
+        <w:rPr>
+          <w:rFonts w:ascii="Arial" w:hAnsi="Arial" w:cs="Arial"/>
+          <w:sz w:val="28"/>
+          <w:szCs w:val="28"/>
+        </w:rPr>
+      </w:pPr>
+    </w:p>
+    <w:p>
+      <w:pPr>
+        <w:spacing w:after="0" w:line="360" w:lineRule="auto"/>
+        <w:ind w:left="0" w:firstLine="2268"/>
+        <w:jc w:val="both"/>
+        <w:rPr>
+          <w:rFonts w:ascii="Arial" w:hAnsi="Arial" w:cs="Arial"/>
+          <w:sz w:val="28"/>
+          <w:szCs w:val="28"/>
+        </w:rPr>
+      </w:pPr>
+      <w:r>
+        <w:rPr>
+          <w:rFonts w:ascii="Arial" w:hAnsi="Arial" w:cs="Arial"/>
+          <w:color w:val="808080"/>
+          <w:sz w:val="28"/>
+        </w:rPr>
+        <w:t xml:space="preserve">Quanto à quitação tácita, dispõe o art. 320 do CC:</w:t>
+      </w:r>
+    </w:p>
+    <w:p>
+      <w:pPr>
+        <w:spacing w:after="0" w:line="360" w:lineRule="auto"/>
+        <w:ind w:left="0" w:firstLine="2268"/>
+        <w:jc w:val="both"/>
+        <w:rPr>
+          <w:rFonts w:ascii="Arial" w:hAnsi="Arial" w:cs="Arial"/>
+          <w:sz w:val="28"/>
+          <w:szCs w:val="28"/>
+        </w:rPr>
+      </w:pPr>
+    </w:p>
+    <w:p>
+      <w:pPr>
+        <w:spacing w:after="0" w:line="360" w:lineRule="auto"/>
+        <w:ind w:left="2268" w:firstLine="0"/>
+        <w:jc w:val="both"/>
+        <w:rPr>
+          <w:rFonts w:ascii="Arial" w:hAnsi="Arial" w:cs="Arial"/>
+          <w:sz w:val="28"/>
+          <w:szCs w:val="28"/>
+        </w:rPr>
+      </w:pPr>
+      <w:r>
+        <w:rPr>
+          <w:rFonts w:ascii="Arial" w:hAnsi="Arial" w:cs="Arial"/>
+          <w:i/>
+          <w:color w:val="808080"/>
+          <w:sz w:val="26"/>
+        </w:rPr>
+        <w:t xml:space="preserve">“Art. 320. A quitação, que sempre poderá ser dada por instrumento particular, designará o valor e a espécie da dívida quitada, o nome do devedor, ou quem por este pagou, o tempo e o lugar do pagamento, com a assinatura do credor, ou do seu representante.</w:t>
+      </w:r>
+    </w:p>
+    <w:p>
+      <w:pPr>
+        <w:spacing w:after="0" w:line="360" w:lineRule="auto"/>
+        <w:ind w:left="2268" w:firstLine="0"/>
+        <w:jc w:val="both"/>
+        <w:rPr>
+          <w:rFonts w:ascii="Arial" w:hAnsi="Arial" w:cs="Arial"/>
+          <w:sz w:val="28"/>
+          <w:szCs w:val="28"/>
+        </w:rPr>
+      </w:pPr>
+      <w:r>
+        <w:rPr>
+          <w:rFonts w:ascii="Arial" w:hAnsi="Arial" w:cs="Arial"/>
+          <w:i/>
+          <w:color w:val="808080"/>
+          <w:sz w:val="26"/>
+        </w:rPr>
+        <w:t xml:space="preserve">(...)</w:t>
+      </w:r>
+    </w:p>
+    <w:p>
+      <w:pPr>
+        <w:spacing w:after="0" w:line="360" w:lineRule="auto"/>
+        <w:ind w:left="2268" w:firstLine="0"/>
+        <w:jc w:val="both"/>
+        <w:rPr>
+          <w:rFonts w:ascii="Arial" w:hAnsi="Arial" w:cs="Arial"/>
+          <w:sz w:val="28"/>
+          <w:szCs w:val="28"/>
+        </w:rPr>
+      </w:pPr>
+      <w:r>
+        <w:rPr>
+          <w:rFonts w:ascii="Arial" w:hAnsi="Arial" w:cs="Arial"/>
+          <w:i/>
+          <w:color w:val="808080"/>
+          <w:sz w:val="26"/>
+        </w:rPr>
+        <w:t xml:space="preserve">Parágrafo único. Ainda sem os requisitos estabelecidos neste artigo valerá a quitação, </w:t>
+      </w:r>
+      <w:r>
+        <w:rPr>
+          <w:rFonts w:ascii="Arial" w:hAnsi="Arial" w:cs="Arial"/>
+          <w:i/>
+          <w:color w:val="808080"/>
+          <w:sz w:val="26"/>
+          <w:u w:val="single"/>
+        </w:rPr>
         <w:t xml:space="preserve">se de seus termos ou das circunstâncias resultar haver sido paga a dívida</w:t>
       </w:r>
       <w:r>
@@ -7391,7 +7968,7 @@
           <w:szCs w:val="28"/>
         </w:rPr>
       </w:pPr>
-      <w:commentRangeStart w:id="19"/>
+      <w:commentRangeStart w:id="20"/>
       <w:r>
         <w:rPr>
           <w:rFonts w:ascii="Arial" w:hAnsi="Arial" w:cs="Arial"/>
@@ -7433,12 +8010,12 @@
         </w:rPr>
         <w:t xml:space="preserve">aceita o beneficiário que se encontra inadimplente no plano de origem.</w:t>
       </w:r>
-      <w:commentRangeEnd w:id="19"/>
+      <w:commentRangeEnd w:id="20"/>
       <w:r>
         <w:rPr>
           <w:rStyle w:val="CommentReference"/>
         </w:rPr>
-        <w:commentReference w:id="19"/>
+        <w:commentReference w:id="20"/>
       </w:r>
     </w:p>
     <w:p>
@@ -7696,7 +8273,7 @@
           <w:szCs w:val="26"/>
         </w:rPr>
       </w:pPr>
-      <w:commentRangeStart w:id="20"/>
+      <w:commentRangeStart w:id="21"/>
       <w:r>
         <w:rPr>
           <w:rFonts w:ascii="Arial" w:hAnsi="Arial" w:cs="Arial"/>
@@ -7779,12 +8356,12 @@
         </w:rPr>
         <w:t xml:space="preserve">)</w:t>
       </w:r>
-      <w:commentRangeEnd w:id="20"/>
+      <w:commentRangeEnd w:id="21"/>
       <w:r>
         <w:rPr>
           <w:rStyle w:val="CommentReference"/>
         </w:rPr>
-        <w:commentReference w:id="20"/>
+        <w:commentReference w:id="21"/>
       </w:r>
       <w:r>
         <w:rPr>
@@ -7898,7 +8475,24 @@
           <w:sz w:val="28"/>
           <w:szCs w:val="28"/>
         </w:rPr>
-        <w:t xml:space="preserve">, cobrando o adimplemento das faturas em aberto (ID 88637464).</w:t>
+        <w:t xml:space="preserve">, cobrando o adimplemento das faturas em aberto (ID 88637464</w:t>
+      </w:r>
+      <w:r>
+        <w:rPr>
+          <w:rFonts w:ascii="Arial" w:hAnsi="Arial" w:cs="Arial"/>
+          <w:color w:val="808080"/>
+          <w:sz w:val="28"/>
+          <w:szCs w:val="28"/>
+        </w:rPr>
+        <w:t xml:space="preserve"> e 88637465</w:t>
+      </w:r>
+      <w:r>
+        <w:rPr>
+          <w:rFonts w:ascii="Arial" w:hAnsi="Arial" w:cs="Arial"/>
+          <w:sz w:val="28"/>
+          <w:szCs w:val="28"/>
+        </w:rPr>
+        <w:t xml:space="preserve">).</w:t>
       </w:r>
     </w:p>
     <w:p>
@@ -7929,6 +8523,7 @@
         </w:rPr>
         <w:t xml:space="preserve">Assim</w:t>
       </w:r>
+      <w:commentRangeStart w:id="22"/>
       <w:r>
         <w:rPr>
           <w:rFonts w:ascii="Arial" w:hAnsi="Arial" w:cs="Arial"/>
@@ -7981,6 +8576,46 @@
         </w:rPr>
         <w:t xml:space="preserve">.</w:t>
       </w:r>
+      <w:commentRangeEnd w:id="22"/>
+      <w:r>
+        <w:rPr>
+          <w:rStyle w:val="CommentReference"/>
+        </w:rPr>
+        <w:commentReference w:id="22"/>
+      </w:r>
+    </w:p>
+    <w:p>
+      <w:pPr>
+        <w:spacing w:after="0" w:line="360" w:lineRule="auto"/>
+        <w:ind w:firstLine="2268"/>
+        <w:jc w:val="both"/>
+        <w:rPr>
+          <w:rFonts w:ascii="Arial" w:hAnsi="Arial" w:cs="Arial"/>
+          <w:sz w:val="28"/>
+          <w:szCs w:val="28"/>
+        </w:rPr>
+      </w:pPr>
+    </w:p>
+    <w:p>
+      <w:pPr>
+        <w:spacing w:after="0" w:line="360" w:lineRule="auto"/>
+        <w:ind w:left="0" w:firstLine="2268"/>
+        <w:jc w:val="both"/>
+        <w:rPr>
+          <w:rFonts w:ascii="Arial" w:hAnsi="Arial" w:cs="Arial"/>
+          <w:sz w:val="28"/>
+          <w:szCs w:val="28"/>
+        </w:rPr>
+      </w:pPr>
+      <w:r>
+        <w:rPr>
+          <w:rFonts w:ascii="Arial" w:hAnsi="Arial" w:cs="Arial"/>
+          <w:color w:val="808080"/>
+          <w:sz w:val="28"/>
+          <w:szCs w:val="28"/>
+        </w:rPr>
+        <w:t xml:space="preserve">No mais, os precedentes invocados no apelo não socorrem a apelante: o do c. STJ apenas enuncia a vedação ao comportamento contraditório, e os dos TJSP e TJRJ, conforme as ementas transcritas, cuidam de declarações de quitação ou de saldo devedor que omitiram débitos, ao passo que a carta dos autos registra a inadimplência (ID 88637463).</w:t>
+      </w:r>
     </w:p>
     <w:p>
       <w:pPr>
@@ -8287,7 +8922,7 @@
         </w:rPr>
         <w:t xml:space="preserve">/apelante ao pagamento de honorários recursais que fixo em 2% do </w:t>
       </w:r>
-      <w:commentRangeStart w:id="21"/>
+      <w:commentRangeStart w:id="23"/>
       <w:r>
         <w:rPr>
           <w:rFonts w:ascii="Arial" w:hAnsi="Arial" w:cs="Arial"/>
@@ -8312,12 +8947,12 @@
         </w:rPr>
         <w:t xml:space="preserve">condenação</w:t>
       </w:r>
-      <w:commentRangeEnd w:id="21"/>
+      <w:commentRangeEnd w:id="23"/>
       <w:r>
         <w:rPr>
           <w:rStyle w:val="CommentReference"/>
         </w:rPr>
-        <w:commentReference w:id="21"/>
+        <w:commentReference w:id="23"/>
       </w:r>
       <w:r>
         <w:rPr>
@@ -8335,7 +8970,7 @@
         </w:rPr>
         <w:t xml:space="preserve"> 85 § 11), acrescido da quantia fixada na </w:t>
       </w:r>
-      <w:commentRangeStart w:id="22"/>
+      <w:commentRangeStart w:id="24"/>
       <w:r>
         <w:rPr>
           <w:rFonts w:ascii="Arial" w:hAnsi="Arial" w:cs="Arial"/>
@@ -8344,12 +8979,12 @@
         </w:rPr>
         <w:t xml:space="preserve">r. sentença</w:t>
       </w:r>
-      <w:commentRangeEnd w:id="22"/>
+      <w:commentRangeEnd w:id="24"/>
       <w:r>
         <w:rPr>
           <w:rStyle w:val="CommentReference"/>
         </w:rPr>
-        <w:commentReference w:id="22"/>
+        <w:commentReference w:id="24"/>
       </w:r>
       <w:r>
         <w:rPr>
@@ -9256,7 +9891,7 @@
       </w:r>
     </w:p>
   </w:comment>
-  <w:comment w:id="4" w:author="Assessor GDSXSR" w:initials="RG" w:date="2026-10-29T00:08:22Z">
+  <w:comment w:id="4" w:author="Assessor GDSXSR" w:initials="RG" w:date="2026-10-29T19:57:29Z">
     <w:p>
       <w:pPr>
         <w:pStyle w:val="CommentText"/>
@@ -9272,7 +9907,7 @@
       </w:r>
     </w:p>
   </w:comment>
-  <w:comment w:id="5" w:author="Assessor GDSXSR" w:initials="RG" w:date="2026-10-29T00:08:22Z">
+  <w:comment w:id="5" w:author="Assessor GDSXSR" w:initials="RG" w:date="2026-10-29T19:57:29Z">
     <w:p>
       <w:pPr>
         <w:pStyle w:val="CommentText"/>
@@ -9288,7 +9923,7 @@
       </w:r>
     </w:p>
   </w:comment>
-  <w:comment w:id="6" w:author="Assessor GDSXSR" w:initials="RG" w:date="2026-10-29T00:08:22Z">
+  <w:comment w:id="6" w:author="Assessor GDSXSR" w:initials="RG" w:date="2026-10-29T19:57:29Z">
     <w:p>
       <w:pPr>
         <w:pStyle w:val="CommentText"/>
@@ -9304,7 +9939,7 @@
       </w:r>
     </w:p>
   </w:comment>
-  <w:comment w:id="7" w:author="Assessor GDSXSR" w:initials="RG" w:date="2026-10-29T00:08:22Z">
+  <w:comment w:id="7" w:author="Assessor GDSXSR" w:initials="RG" w:date="2026-10-29T19:57:29Z">
     <w:p>
       <w:pPr>
         <w:pStyle w:val="CommentText"/>
@@ -9316,11 +9951,27 @@
         <w:annotationRef/>
       </w:r>
       <w:r>
+        <w:t>ASSESSOR GDSXSR — Reescrevi o item 3 conforme as razões do apelo (ID 88637491, itens 3.1 a 3.3 e narrativa inicial), que não alega propriamente "inexistência do débito", mas violação da boa-fé, supressio, aplicação do CDC e falta dos boletos (C-3P b).</w:t>
+      </w:r>
+    </w:p>
+  </w:comment>
+  <w:comment w:id="8" w:author="Assessor GDSXSR" w:initials="RG" w:date="2026-10-29T19:57:29Z">
+    <w:p>
+      <w:pPr>
+        <w:pStyle w:val="CommentText"/>
+      </w:pPr>
+      <w:r>
+        <w:rPr>
+          <w:rStyle w:val="CommentReference"/>
+        </w:rPr>
+        <w:annotationRef/>
+      </w:r>
+      <w:r>
         <w:t>ASSESSOR GDSXSR — Alterei "Dispositivos relevantes citados" para a forma compacta (C-20) e retirei CPC 487 I, que o voto não cita (C-33).</w:t>
       </w:r>
     </w:p>
   </w:comment>
-  <w:comment w:id="8" w:author="Assessor GDSXSR" w:initials="RG" w:date="2026-10-29T00:08:22Z">
+  <w:comment w:id="9" w:author="Assessor GDSXSR" w:initials="RG" w:date="2026-10-29T19:57:29Z">
     <w:p>
       <w:pPr>
         <w:pStyle w:val="CommentText"/>
@@ -9336,7 +9987,7 @@
       </w:r>
     </w:p>
   </w:comment>
-  <w:comment w:id="9" w:author="Assessor GDSXSR" w:initials="RG" w:date="2026-10-29T00:08:22Z">
+  <w:comment w:id="10" w:author="Assessor GDSXSR" w:initials="RG" w:date="2026-10-29T19:57:29Z">
     <w:p>
       <w:pPr>
         <w:pStyle w:val="CommentText"/>
@@ -9352,7 +10003,7 @@
       </w:r>
     </w:p>
   </w:comment>
-  <w:comment w:id="10" w:author="Assessor GDSXSR" w:initials="RG" w:date="2026-10-29T00:08:22Z">
+  <w:comment w:id="11" w:author="Assessor GDSXSR" w:initials="RG" w:date="2026-10-29T19:57:29Z">
     <w:p>
       <w:pPr>
         <w:pStyle w:val="CommentText"/>
@@ -9368,7 +10019,7 @@
       </w:r>
     </w:p>
   </w:comment>
-  <w:comment w:id="11" w:author="Assessor GDSXSR" w:initials="RG" w:date="2026-10-29T00:08:22Z">
+  <w:comment w:id="12" w:author="Assessor GDSXSR" w:initials="RG" w:date="2026-10-29T19:57:29Z">
     <w:p>
       <w:pPr>
         <w:pStyle w:val="CommentText"/>
@@ -9380,11 +10031,11 @@
         <w:annotationRef/>
       </w:r>
       <w:r>
-        <w:t>ASSESSOR GDSXSR — Pendência (C-22, C-52): nome do juiz e da vara conforme a minuta; sem acesso ao PJe nesta revisão, conferir a forma exata no ID da sentença.</w:t>
+        <w:t>ASSESSOR GDSXSR — Corrigi o nome do juiz para "Heverson", como na assinatura da sentença (ID 88637481), que também confirma a 12ª Vara Cível de Brasília (C-22). Acrescentei o ID da sentença ao fim do dispositivo transcrito (C-3N).</w:t>
       </w:r>
     </w:p>
   </w:comment>
-  <w:comment w:id="12" w:author="Assessor GDSXSR" w:initials="RG" w:date="2026-10-29T00:08:22Z">
+  <w:comment w:id="13" w:author="Assessor GDSXSR" w:initials="RG" w:date="2026-10-29T19:57:29Z">
     <w:p>
       <w:pPr>
         <w:pStyle w:val="CommentText"/>
@@ -9396,11 +10047,11 @@
         <w:annotationRef/>
       </w:r>
       <w:r>
-        <w:t>ASSESSOR GDSXSR — Enumerei as alegações do apelo no relatório (C-30), que traziam só a tese do ônus da prova; as demais constam do resumo do apelo e do voto da minuta. Pendência (C-24, C-52): conferir a redação com o apelo (ID 88637491), que não foi recebido.</w:t>
+        <w:t>ASSESSOR GDSXSR — Enumerei as alegações do apelo no relatório (C-30), conforme as razões do apelo (ID 88637491, itens 3.1 a 3.3 e narrativa inicial); a versão anterior trazia só o ônus da prova e os boletos, e o apelo não discute o ônus da prova.</w:t>
       </w:r>
     </w:p>
   </w:comment>
-  <w:comment w:id="13" w:author="Assessor GDSXSR" w:initials="RG" w:date="2026-10-29T00:08:22Z">
+  <w:comment w:id="14" w:author="Assessor GDSXSR" w:initials="RG" w:date="2026-10-29T19:57:29Z">
     <w:p>
       <w:pPr>
         <w:pStyle w:val="CommentText"/>
@@ -9412,11 +10063,11 @@
         <w:annotationRef/>
       </w:r>
       <w:r>
-        <w:t>ASSESSOR GDSXSR — Pendência (C-52): o ID das contrarrazões (85547286) é anterior ao ID do apelo (88637491), o que sugere erro; conferir no PJe. Movi o ID para logo após "Contrarrazões" (perfil APC, n. 2).</w:t>
+        <w:t>ASSESSOR GDSXSR — Corrigi o ID das contrarrazões ao apelo: 85547286 não consta dos autos; as contrarrazões de 25/08/2026 são o ID 88637494 (o ID 88637486 são contrarrazões aos embargos). Movi o ID para logo após "Contrarrazões" (perfil APC, n. 2).</w:t>
       </w:r>
     </w:p>
   </w:comment>
-  <w:comment w:id="14" w:author="Assessor GDSXSR" w:initials="RG" w:date="2026-10-29T00:08:22Z">
+  <w:comment w:id="15" w:author="Assessor GDSXSR" w:initials="RG" w:date="2026-10-29T19:57:29Z">
     <w:p>
       <w:pPr>
         <w:pStyle w:val="CommentText"/>
@@ -9428,11 +10079,11 @@
         <w:annotationRef/>
       </w:r>
       <w:r>
-        <w:t>ASSESSOR GDSXSR — A minuta dizia que a sentença foi "complementada por embargos de declaração", mas o relatório informa que os embargos foram rejeitados (ID 88637488); ajustei a linha de dados e as datas (dd/mm/aaaa). Pendência (C-52): conferir no PJe a data da rejeição dos embargos (08/07/2026).</w:t>
+        <w:t>ASSESSOR GDSXSR — Datas conferidas nos autos: inicial em 28/03/2025 (ID 88637031); sentença em 03/06/2026 (ID 88637481); embargos de declaração rejeitados em 08/07/2026 (ID 88637488); apelo em 30/07/2026 (ID 88637491). A minuta dizia "complementada por embargos", e o ajuste diz o que os autos mostram (C-3C).</w:t>
       </w:r>
     </w:p>
   </w:comment>
-  <w:comment w:id="15" w:author="Assessor GDSXSR" w:initials="RG" w:date="2026-10-29T00:08:22Z">
+  <w:comment w:id="16" w:author="Assessor GDSXSR" w:initials="RG" w:date="2026-10-29T19:57:29Z">
     <w:p>
       <w:pPr>
         <w:pStyle w:val="CommentText"/>
@@ -9448,7 +10099,7 @@
       </w:r>
     </w:p>
   </w:comment>
-  <w:comment w:id="16" w:author="Assessor GDSXSR" w:initials="RG" w:date="2026-10-29T00:08:22Z">
+  <w:comment w:id="17" w:author="Assessor GDSXSR" w:initials="RG" w:date="2026-10-29T19:57:30Z">
     <w:p>
       <w:pPr>
         <w:pStyle w:val="CommentText"/>
@@ -9460,11 +10111,11 @@
         <w:annotationRef/>
       </w:r>
       <w:r>
-        <w:t>ASSESSOR GDSXSR — Pendência (C-20, C-52): a minuta não indica o ID, no PJe de 2º grau, que comprova a autogestão (a sentença cita o regulamento do plano, ID 230783708 na origem); incluir o ID depois de conferir.</w:t>
+        <w:t>ASSESSOR GDSXSR — Acrescentei o ID de 2º grau do regulamento do plano (88637033), que o classifica como autogestão (C-20); a sentença citava o ID da origem (230783708).</w:t>
       </w:r>
     </w:p>
   </w:comment>
-  <w:comment w:id="17" w:author="Assessor GDSXSR" w:initials="RG" w:date="2026-10-29T00:08:22Z">
+  <w:comment w:id="18" w:author="Assessor GDSXSR" w:initials="RG" w:date="2026-10-29T19:57:30Z">
     <w:p>
       <w:pPr>
         <w:pStyle w:val="CommentText"/>
@@ -9480,7 +10131,7 @@
       </w:r>
     </w:p>
   </w:comment>
-  <w:comment w:id="18" w:author="Assessor GDSXSR" w:initials="RG" w:date="2026-10-29T00:08:22Z">
+  <w:comment w:id="19" w:author="Assessor GDSXSR" w:initials="RG" w:date="2026-10-29T19:57:30Z">
     <w:p>
       <w:pPr>
         <w:pStyle w:val="CommentText"/>
@@ -9492,11 +10143,11 @@
         <w:annotationRef/>
       </w:r>
       <w:r>
-        <w:t>ASSESSOR GDSXSR — Troquei "carta de quitação" por "carta de portabilidade", nome usado no resto do voto, e movi o ID para o fim do período (C-20). Pendência (C-66 c, C-24): transcrever o trecho da carta (ID 88637463) em que consta "situação financeira atual do contrato: INADIMPLENTE"; o documento não foi recebido. Inseri o CC 320, caput e parágrafo único, em bloco, na redação do Planalto (C-66 a).</w:t>
+        <w:t>ASSESSOR GDSXSR — Troquei "carta de quitação" por "carta de portabilidade", nome usado no resto do voto, e movi o ID para o fim do período (C-20). Transcrevi o trecho decisivo da carta, conferido nos autos (ID 88637463, p. 1), e o CC 320, caput e parágrafo único, na redação do Planalto (C-66 a, c).</w:t>
       </w:r>
     </w:p>
   </w:comment>
-  <w:comment w:id="19" w:author="Assessor GDSXSR" w:initials="RG" w:date="2026-10-29T00:08:22Z">
+  <w:comment w:id="20" w:author="Assessor GDSXSR" w:initials="RG" w:date="2026-10-29T19:57:30Z">
     <w:p>
       <w:pPr>
         <w:pStyle w:val="CommentText"/>
@@ -9512,7 +10163,7 @@
       </w:r>
     </w:p>
   </w:comment>
-  <w:comment w:id="20" w:author="Assessor GDSXSR" w:initials="RG" w:date="2026-10-29T00:08:22Z">
+  <w:comment w:id="21" w:author="Assessor GDSXSR" w:initials="RG" w:date="2026-10-29T19:57:30Z">
     <w:p>
       <w:pPr>
         <w:pStyle w:val="CommentText"/>
@@ -9528,7 +10179,7 @@
       </w:r>
     </w:p>
   </w:comment>
-  <w:comment w:id="21" w:author="Assessor GDSXSR" w:initials="RG" w:date="2026-10-29T00:08:22Z">
+  <w:comment w:id="22" w:author="Assessor GDSXSR" w:initials="RG" w:date="2026-10-29T19:57:30Z">
     <w:p>
       <w:pPr>
         <w:pStyle w:val="CommentText"/>
@@ -9540,11 +10191,27 @@
         <w:annotationRef/>
       </w:r>
       <w:r>
-        <w:t>ASSESSOR GDSXSR — Valor da condenação (C-51): R$ 12.285,76, valor nominal fixado na sentença (ID 85547281), sem atualização; a base é a mesma da sentença.</w:t>
+        <w:t>ASSESSOR GDSXSR — Acrescentei parágrafo em bloco sobre os precedentes invocados no apelo (perfil APC). Pendência (C-72, C-52): o AgInt no AREsp 1845231/SP, o TJSP 1002341-89.2021.8.26.0100 e o TJRJ 0045212-32.2020.8.19.0001 não foram localizados no iajus; a descrição se apoia só nas ementas transcritas no apelo (ID 88637491), e a conferência nos portais fica para você. Notificação de 23/05/2023: e-mail de cobrança (ID 88637464) e carta de 11/05/2023 (ID 88637465), conferidos.</w:t>
       </w:r>
     </w:p>
   </w:comment>
-  <w:comment w:id="22" w:author="Assessor GDSXSR" w:initials="RG" w:date="2026-10-29T00:08:22Z">
+  <w:comment w:id="23" w:author="Assessor GDSXSR" w:initials="RG" w:date="2026-10-29T19:57:30Z">
+    <w:p>
+      <w:pPr>
+        <w:pStyle w:val="CommentText"/>
+      </w:pPr>
+      <w:r>
+        <w:rPr>
+          <w:rStyle w:val="CommentReference"/>
+        </w:rPr>
+        <w:annotationRef/>
+      </w:r>
+      <w:r>
+        <w:t>ASSESSOR GDSXSR — Valor da condenação (C-51): R$ 12.285,76, valor nominal fixado na sentença (ID 88637481), sem atualização; a base é a mesma da sentença. A ré não tem gratuidade (recolheu o preparo, ID 88637490), então não há suspensão da exigibilidade.</w:t>
+      </w:r>
+    </w:p>
+  </w:comment>
+  <w:comment w:id="24" w:author="Assessor GDSXSR" w:initials="RG" w:date="2026-10-29T19:57:30Z">
     <w:p>
       <w:pPr>
         <w:pStyle w:val="CommentText"/>

</xml_diff>